<commit_message>
Comprehensive documentation suite & README audit: integrate Tab 5 Dual-Engine AI Chatbot, 16-Sheet Excel references, and test cases across all Docs, Folder READMEs, and master Word docx
</commit_message>
<xml_diff>
--- a/Project Documentations/Carbon_Heist_Mitigation_Documentation.docx
+++ b/Project Documentations/Carbon_Heist_Mitigation_Documentation.docx
@@ -5081,11 +5081,7 @@
           </w:tcPr>
           <w:p>
             <w:r>
-              <w:rPr>
-                <w:sz w:val="19"/>
-                <w:szCs w:val="19"/>
-              </w:rPr>
-              <w:t>13-sheet domain reference workbook.</w:t>
+              <w:t>16-sheet domain reference workbook.</w:t>
             </w:r>
           </w:p>
         </w:tc>
@@ -7002,6 +6998,11 @@
       </w:r>
       <w:r>
         <w:t>As a Data Analyst, I want automated cleaning for verified analysis.</w:t>
+      </w:r>
+    </w:p>
+    <w:p>
+      <w:r>
+        <w:t>US-05: As a C-Suite Executive, I want to converse with a dedicated AI Co-Pilot in Tab 5 to query portfolio breakdowns and dynamically generate custom Plotly charts on-the-fly without writing SQL or filtering rows.</w:t>
       </w:r>
     </w:p>
     <w:p>
@@ -7489,6 +7490,48 @@
           </w:p>
         </w:tc>
       </w:tr>
+      <w:tr>
+        <w:tc>
+          <w:tcPr>
+            <w:tcW w:type="dxa" w:w="1200"/>
+          </w:tcPr>
+          <w:p>
+            <w:r>
+              <w:t>UC-05</w:t>
+            </w:r>
+          </w:p>
+        </w:tc>
+        <w:tc>
+          <w:tcPr>
+            <w:tcW w:type="dxa" w:w="2600"/>
+          </w:tcPr>
+          <w:p>
+            <w:r>
+              <w:t>Conversational AI &amp; Dynamic Charting</w:t>
+            </w:r>
+          </w:p>
+        </w:tc>
+        <w:tc>
+          <w:tcPr>
+            <w:tcW w:type="dxa" w:w="1900"/>
+          </w:tcPr>
+          <w:p>
+            <w:r>
+              <w:t>C-Suite Executive / Asset Owner</w:t>
+            </w:r>
+          </w:p>
+        </w:tc>
+        <w:tc>
+          <w:tcPr>
+            <w:tcW w:type="dxa" w:w="3650"/>
+          </w:tcPr>
+          <w:p>
+            <w:r>
+              <w:t>Query the 11,639-building portfolio via Tab 5 Dual-Engine AI Co-Pilot (Gemini 2.5 Flash + offline fallback) to receive instant natural-language insights and custom interactive Plotly charts.</w:t>
+            </w:r>
+          </w:p>
+        </w:tc>
+      </w:tr>
     </w:tbl>
     <w:p>
       <w:pPr>
@@ -7637,31 +7680,12 @@
         <w:spacing w:after="100" w:line="280" w:lineRule="auto"/>
       </w:pPr>
       <w:r>
-        <w:rPr>
-          <w:b/>
-          <w:bCs/>
-          <w:color w:val="0B3D2E"/>
-        </w:rPr>
-        <w:t xml:space="preserve">FR-05: </w:t>
-      </w:r>
-      <w:r>
-        <w:t xml:space="preserve">Interactive KPI cards and playbook recommendations via </w:t>
-      </w:r>
-      <w:proofErr w:type="spellStart"/>
-      <w:r>
-        <w:t>Streamlit</w:t>
-      </w:r>
-      <w:proofErr w:type="spellEnd"/>
-      <w:r>
-        <w:t>/</w:t>
-      </w:r>
-      <w:proofErr w:type="spellStart"/>
-      <w:r>
-        <w:t>Plotly</w:t>
-      </w:r>
-      <w:proofErr w:type="spellEnd"/>
-      <w:r>
-        <w:t>.</w:t>
+        <w:t>FR-05: Interactive KPI cards and playbook recommendations via Streamlit/Plotly across 5 specialized analytical tabs.</w:t>
+      </w:r>
+    </w:p>
+    <w:p>
+      <w:r>
+        <w:t>FR-07: Dual-Engine Conversational AI &amp; Dynamic Charting (Tab 5) integrating Google Gemini 2.5 Flash and local offline quantitative fallback for on-the-fly interactive Plotly chart generation.</w:t>
       </w:r>
     </w:p>
     <w:p>
@@ -12159,11 +12183,7 @@
           </w:tcPr>
           <w:p>
             <w:r>
-              <w:rPr>
-                <w:sz w:val="19"/>
-                <w:szCs w:val="19"/>
-              </w:rPr>
-              <w:t>Co2 Project.xlsx (13 sheets)</w:t>
+              <w:t>Co2 Project.xlsx (16 Sheets)</w:t>
             </w:r>
           </w:p>
         </w:tc>
@@ -13926,6 +13946,130 @@
           </w:p>
         </w:tc>
       </w:tr>
+      <w:tr>
+        <w:tc>
+          <w:tcPr>
+            <w:tcW w:type="dxa" w:w="1000"/>
+          </w:tcPr>
+          <w:p>
+            <w:r>
+              <w:t>TC-08</w:t>
+            </w:r>
+          </w:p>
+        </w:tc>
+        <w:tc>
+          <w:tcPr>
+            <w:tcW w:type="dxa" w:w="1350"/>
+          </w:tcPr>
+          <w:p>
+            <w:r>
+              <w:t>AI Co-Pilot / Tab 5</w:t>
+            </w:r>
+          </w:p>
+        </w:tc>
+        <w:tc>
+          <w:tcPr>
+            <w:tcW w:type="dxa" w:w="2200"/>
+          </w:tcPr>
+          <w:p>
+            <w:r>
+              <w:t>Query Tab 5 in English/Arabic ("Show top 5 emitting property types")</w:t>
+            </w:r>
+          </w:p>
+        </w:tc>
+        <w:tc>
+          <w:tcPr>
+            <w:tcW w:type="dxa" w:w="1900"/>
+          </w:tcPr>
+          <w:p>
+            <w:r>
+              <w:t>System parses intent, calculates totals from local dataset, and renders interactive Plotly chart inside chat</w:t>
+            </w:r>
+          </w:p>
+        </w:tc>
+        <w:tc>
+          <w:tcPr>
+            <w:tcW w:type="dxa" w:w="1700"/>
+          </w:tcPr>
+          <w:p>
+            <w:r>
+              <w:t>Generated chart &amp; text response</w:t>
+            </w:r>
+          </w:p>
+        </w:tc>
+        <w:tc>
+          <w:tcPr>
+            <w:tcW w:type="dxa" w:w="1200"/>
+          </w:tcPr>
+          <w:p>
+            <w:r>
+              <w:t>PASS</w:t>
+            </w:r>
+          </w:p>
+        </w:tc>
+      </w:tr>
+      <w:tr>
+        <w:tc>
+          <w:tcPr>
+            <w:tcW w:type="dxa" w:w="1000"/>
+          </w:tcPr>
+          <w:p>
+            <w:r>
+              <w:t>TC-09</w:t>
+            </w:r>
+          </w:p>
+        </w:tc>
+        <w:tc>
+          <w:tcPr>
+            <w:tcW w:type="dxa" w:w="1350"/>
+          </w:tcPr>
+          <w:p>
+            <w:r>
+              <w:t>AI Co-Pilot / Tab 5</w:t>
+            </w:r>
+          </w:p>
+        </w:tc>
+        <w:tc>
+          <w:tcPr>
+            <w:tcW w:type="dxa" w:w="2200"/>
+          </w:tcPr>
+          <w:p>
+            <w:r>
+              <w:t>API Rate-Limit Shielding (HTTP 429 / No API Key)</w:t>
+            </w:r>
+          </w:p>
+        </w:tc>
+        <w:tc>
+          <w:tcPr>
+            <w:tcW w:type="dxa" w:w="1900"/>
+          </w:tcPr>
+          <w:p>
+            <w:r>
+              <w:t>System catches exception and routes prompt to embedded local quantitative charting engine without crashing</w:t>
+            </w:r>
+          </w:p>
+        </w:tc>
+        <w:tc>
+          <w:tcPr>
+            <w:tcW w:type="dxa" w:w="1700"/>
+          </w:tcPr>
+          <w:p>
+            <w:r>
+              <w:t>Zero downtime, instant local chart fallback</w:t>
+            </w:r>
+          </w:p>
+        </w:tc>
+        <w:tc>
+          <w:tcPr>
+            <w:tcW w:type="dxa" w:w="1200"/>
+          </w:tcPr>
+          <w:p>
+            <w:r>
+              <w:t>PASS</w:t>
+            </w:r>
+          </w:p>
+        </w:tc>
+      </w:tr>
     </w:tbl>
     <w:p>
       <w:pPr>
@@ -15680,15 +15824,7 @@
         <w:spacing w:after="100" w:line="280" w:lineRule="auto"/>
       </w:pPr>
       <w:r>
-        <w:rPr>
-          <w:b/>
-          <w:bCs/>
-          <w:color w:val="0B3D2E"/>
-        </w:rPr>
-        <w:t xml:space="preserve">Step 1 – Configure: </w:t>
-      </w:r>
-      <w:r>
-        <w:t>Use sidebar to select Borough, Property Type, Year Built, and GFA.</w:t>
+        <w:t>Step 1 – Configure Profile: Use sidebar controls to select Borough, Property Type, Year Built, and GFA.</w:t>
       </w:r>
     </w:p>
     <w:p>
@@ -15701,28 +15837,12 @@
         <w:spacing w:after="100" w:line="280" w:lineRule="auto"/>
       </w:pPr>
       <w:r>
-        <w:rPr>
-          <w:b/>
-          <w:bCs/>
-          <w:color w:val="0B3D2E"/>
-        </w:rPr>
-        <w:t xml:space="preserve">Step 2 – Review KPIs: </w:t>
-      </w:r>
-      <w:r>
-        <w:t>Check Predicted Emissions (MT CO2e), Carbon Liability ($/</w:t>
-      </w:r>
-      <w:proofErr w:type="spellStart"/>
-      <w:r>
-        <w:t>sqft</w:t>
-      </w:r>
-      <w:proofErr w:type="spellEnd"/>
-      <w:r>
-        <w:t>), Peer Gap.</w:t>
+        <w:t>Step 2 – Tab 1 &amp; Tab 3 Analysis: Review real-time KPI cards, predicted GHG emissions (R² = 81.65%), liability ($/sqft), and peer gaps.</w:t>
       </w:r>
     </w:p>
     <w:p>
       <w:r>
-        <w:t>Step 4 – AI Chatbot: Ask natural-language strategic questions or query 'top 10 buildings' to render instant interactive Plotly charts and executive audits (Dual-Engine: Gemini 2.5 Flash + Local Fallback).</w:t>
+        <w:t>Step 4 – Tab 5 AI Chatbot: Ask natural-language strategic questions in English or Arabic to dynamically generate custom interactive Plotly charts and quantitative audits (Dual-Engine: Gemini 2.5 Flash + Local Fallback).</w:t>
       </w:r>
     </w:p>
     <w:p>
@@ -15735,7 +15855,7 @@
         <w:spacing w:after="100" w:line="280" w:lineRule="auto"/>
       </w:pPr>
       <w:r>
-        <w:t>Step 3 – Simulate: Model HVAC, insulation, and electrification upgrades for penalty savings.</w:t>
+        <w:t>Step 3 – Tab 2 &amp; Tab 4 Simulation: Model HVAC retro-commissioning, envelope insulation, and electrification upgrades across the 5 Decarbonization Playbooks.</w:t>
       </w:r>
     </w:p>
     <w:p>

</xml_diff>

<commit_message>
Add and standardize live Streamlit app badge & link (https://carbon-heist-mitigation.streamlit.app/) across all Docs, folder READMEs, and master Word docx
</commit_message>
<xml_diff>
--- a/Project Documentations/Carbon_Heist_Mitigation_Documentation.docx
+++ b/Project Documentations/Carbon_Heist_Mitigation_Documentation.docx
@@ -33,283 +33,27 @@
             <w:vAlign w:val="center"/>
           </w:tcPr>
           <w:p>
-            <w:pPr>
-              <w:spacing w:before="1600"/>
-            </w:pPr>
-          </w:p>
-          <w:p>
-            <w:pPr>
-              <w:spacing w:after="60"/>
-              <w:jc w:val="center"/>
-            </w:pPr>
-            <w:r>
-              <w:rPr>
-                <w:b/>
-                <w:bCs/>
-                <w:color w:val="FFFFFF"/>
-                <w:sz w:val="72"/>
-                <w:szCs w:val="72"/>
-              </w:rPr>
+            <w:r>
+              <w:br/>
               <w:t>CARBON HEIST</w:t>
-            </w:r>
-          </w:p>
-          <w:p>
-            <w:pPr>
-              <w:spacing w:after="260"/>
-              <w:jc w:val="center"/>
-            </w:pPr>
-            <w:r>
-              <w:rPr>
-                <w:b/>
-                <w:bCs/>
-                <w:color w:val="C89B3C"/>
-                <w:sz w:val="44"/>
-                <w:szCs w:val="44"/>
-              </w:rPr>
+              <w:br/>
               <w:t>MITIGATION PLATFORM</w:t>
-            </w:r>
-          </w:p>
-          <w:p>
-            <w:pPr>
-              <w:pBdr>
-                <w:top w:val="single" w:sz="6" w:space="14" w:color="C89B3C"/>
-              </w:pBdr>
-              <w:spacing w:after="40"/>
-              <w:jc w:val="center"/>
-            </w:pPr>
-            <w:r>
-              <w:rPr>
-                <w:color w:val="FFFFFF"/>
-                <w:sz w:val="22"/>
-                <w:szCs w:val="22"/>
-              </w:rPr>
+              <w:br/>
               <w:t>NYC LOCAL LAW 97 DECARBONIZATION INTELLIGENCE SYSTEM</w:t>
-            </w:r>
-          </w:p>
-          <w:p>
-            <w:pPr>
-              <w:spacing w:before="700" w:after="40"/>
-              <w:jc w:val="center"/>
-            </w:pPr>
-            <w:r>
-              <w:rPr>
-                <w:i/>
-                <w:iCs/>
-                <w:color w:val="FFFFFF"/>
-                <w:sz w:val="22"/>
-                <w:szCs w:val="22"/>
-              </w:rPr>
+              <w:br/>
               <w:t>Data Analysis &amp; Engineering Track</w:t>
-            </w:r>
-          </w:p>
-          <w:p>
-            <w:pPr>
-              <w:spacing w:after="700"/>
-              <w:jc w:val="center"/>
-            </w:pPr>
-            <w:r>
-              <w:rPr>
-                <w:i/>
-                <w:iCs/>
-                <w:color w:val="FFFFFF"/>
-                <w:sz w:val="22"/>
-                <w:szCs w:val="22"/>
-              </w:rPr>
+              <w:br/>
               <w:t>Project Documentation Suite</w:t>
-            </w:r>
-          </w:p>
-          <w:p>
-            <w:pPr>
-              <w:spacing w:after="90"/>
-              <w:jc w:val="center"/>
-            </w:pPr>
-            <w:r>
-              <w:rPr>
-                <w:b/>
-                <w:bCs/>
-                <w:color w:val="C89B3C"/>
-                <w:sz w:val="20"/>
-                <w:szCs w:val="20"/>
-              </w:rPr>
-              <w:t>Project Track</w:t>
-            </w:r>
-            <w:proofErr w:type="gramStart"/>
-            <w:r>
-              <w:rPr>
-                <w:b/>
-                <w:bCs/>
-                <w:color w:val="C89B3C"/>
-                <w:sz w:val="20"/>
-                <w:szCs w:val="20"/>
-              </w:rPr>
-              <w:t xml:space="preserve">:  </w:t>
-            </w:r>
-            <w:r>
-              <w:rPr>
-                <w:color w:val="FFFFFF"/>
-                <w:sz w:val="20"/>
-                <w:szCs w:val="20"/>
-              </w:rPr>
-              <w:t>Data</w:t>
-            </w:r>
-            <w:proofErr w:type="gramEnd"/>
-            <w:r>
-              <w:rPr>
-                <w:color w:val="FFFFFF"/>
-                <w:sz w:val="20"/>
-                <w:szCs w:val="20"/>
-              </w:rPr>
-              <w:t xml:space="preserve"> Analysis &amp; Engineering</w:t>
-            </w:r>
-          </w:p>
-          <w:p>
-            <w:pPr>
-              <w:spacing w:after="90"/>
-              <w:jc w:val="center"/>
-            </w:pPr>
-            <w:r>
-              <w:rPr>
-                <w:b/>
-                <w:bCs/>
-                <w:color w:val="C89B3C"/>
-                <w:sz w:val="20"/>
-                <w:szCs w:val="20"/>
-              </w:rPr>
-              <w:t>Domain</w:t>
-            </w:r>
-            <w:proofErr w:type="gramStart"/>
-            <w:r>
-              <w:rPr>
-                <w:b/>
-                <w:bCs/>
-                <w:color w:val="C89B3C"/>
-                <w:sz w:val="20"/>
-                <w:szCs w:val="20"/>
-              </w:rPr>
-              <w:t xml:space="preserve">:  </w:t>
-            </w:r>
-            <w:r>
-              <w:rPr>
-                <w:color w:val="FFFFFF"/>
-                <w:sz w:val="20"/>
-                <w:szCs w:val="20"/>
-              </w:rPr>
-              <w:t>Urban</w:t>
-            </w:r>
-            <w:proofErr w:type="gramEnd"/>
-            <w:r>
-              <w:rPr>
-                <w:color w:val="FFFFFF"/>
-                <w:sz w:val="20"/>
-                <w:szCs w:val="20"/>
-              </w:rPr>
-              <w:t xml:space="preserve"> Sustainability, ML &amp; Financial Risk Modeling</w:t>
-            </w:r>
-          </w:p>
-          <w:p>
-            <w:pPr>
-              <w:spacing w:after="90"/>
-              <w:jc w:val="center"/>
-            </w:pPr>
-            <w:r>
-              <w:rPr>
-                <w:b/>
-                <w:bCs/>
-                <w:color w:val="C89B3C"/>
-                <w:sz w:val="20"/>
-                <w:szCs w:val="20"/>
-              </w:rPr>
-              <w:t>Repository</w:t>
-            </w:r>
-            <w:proofErr w:type="gramStart"/>
-            <w:r>
-              <w:rPr>
-                <w:b/>
-                <w:bCs/>
-                <w:color w:val="C89B3C"/>
-                <w:sz w:val="20"/>
-                <w:szCs w:val="20"/>
-              </w:rPr>
-              <w:t xml:space="preserve">:  </w:t>
-            </w:r>
-            <w:r>
-              <w:rPr>
-                <w:color w:val="FFFFFF"/>
-                <w:sz w:val="20"/>
-                <w:szCs w:val="20"/>
-              </w:rPr>
-              <w:t>github.com</w:t>
-            </w:r>
-            <w:proofErr w:type="gramEnd"/>
-            <w:r>
-              <w:rPr>
-                <w:color w:val="FFFFFF"/>
-                <w:sz w:val="20"/>
-                <w:szCs w:val="20"/>
-              </w:rPr>
-              <w:t>/</w:t>
-            </w:r>
-            <w:proofErr w:type="spellStart"/>
-            <w:r>
-              <w:rPr>
-                <w:color w:val="FFFFFF"/>
-                <w:sz w:val="20"/>
-                <w:szCs w:val="20"/>
-              </w:rPr>
-              <w:t>ahmedadelamin</w:t>
-            </w:r>
-            <w:proofErr w:type="spellEnd"/>
-            <w:r>
-              <w:rPr>
-                <w:color w:val="FFFFFF"/>
-                <w:sz w:val="20"/>
-                <w:szCs w:val="20"/>
-              </w:rPr>
-              <w:t>/carbon-heist-mitigation</w:t>
-            </w:r>
-          </w:p>
-          <w:p>
-            <w:pPr>
-              <w:spacing w:after="90"/>
-              <w:jc w:val="center"/>
-            </w:pPr>
-            <w:r>
-              <w:rPr>
-                <w:b/>
-                <w:bCs/>
-                <w:color w:val="C89B3C"/>
-                <w:sz w:val="20"/>
-                <w:szCs w:val="20"/>
-              </w:rPr>
-              <w:t>Version</w:t>
-            </w:r>
-            <w:proofErr w:type="gramStart"/>
-            <w:r>
-              <w:rPr>
-                <w:b/>
-                <w:bCs/>
-                <w:color w:val="C89B3C"/>
-                <w:sz w:val="20"/>
-                <w:szCs w:val="20"/>
-              </w:rPr>
-              <w:t xml:space="preserve">:  </w:t>
-            </w:r>
-            <w:r>
-              <w:rPr>
-                <w:color w:val="FFFFFF"/>
-                <w:sz w:val="20"/>
-                <w:szCs w:val="20"/>
-              </w:rPr>
-              <w:t>v1</w:t>
-            </w:r>
-            <w:proofErr w:type="gramEnd"/>
-            <w:r>
-              <w:rPr>
-                <w:color w:val="FFFFFF"/>
-                <w:sz w:val="20"/>
-                <w:szCs w:val="20"/>
-              </w:rPr>
-              <w:t>.0   |   July 2026</w:t>
+              <w:br/>
+              <w:t>Project Track:  Data Analysis &amp; Engineering</w:t>
+              <w:br/>
+              <w:t>Domain:  Urban Sustainability, ML &amp; Financial Risk Modeling</w:t>
+              <w:br/>
+              <w:t>Repository:  github.com/ahmedadelamin/carbon-heist-mitigation</w:t>
+              <w:br/>
+              <w:t>Live Streamlit App:  https://carbon-heist-mitigation.streamlit.app/</w:t>
+              <w:br/>
+              <w:t>Version:  v1.0   |   July 2026</w:t>
             </w:r>
           </w:p>
         </w:tc>
@@ -1616,33 +1360,8 @@
       </w:r>
     </w:p>
     <w:p>
-      <w:pPr>
-        <w:spacing w:after="80"/>
-        <w:ind w:left="360"/>
-      </w:pPr>
-      <w:proofErr w:type="gramStart"/>
-      <w:r>
-        <w:rPr>
-          <w:color w:val="555555"/>
-          <w:sz w:val="20"/>
-          <w:szCs w:val="20"/>
-        </w:rPr>
-        <w:t xml:space="preserve">1.2  </w:t>
-      </w:r>
-      <w:r>
-        <w:rPr>
-          <w:sz w:val="20"/>
-          <w:szCs w:val="20"/>
-        </w:rPr>
-        <w:t>Project</w:t>
-      </w:r>
-      <w:proofErr w:type="gramEnd"/>
-      <w:r>
-        <w:rPr>
-          <w:sz w:val="20"/>
-          <w:szCs w:val="20"/>
-        </w:rPr>
-        <w:t xml:space="preserve"> Plan &amp; Timeline</w:t>
+      <w:r>
+        <w:t>Live C-Suite Executive Streamlit Dashboard: https://carbon-heist-mitigation.streamlit.app/ (Access real-time portfolio emissions analysis, 5-playbook simulation, ML risk inference, and Tab 5 Dual-Engine AI Chatbot directly online).</w:t>
       </w:r>
     </w:p>
     <w:p>
@@ -1657,14 +1376,14 @@
           <w:sz w:val="20"/>
           <w:szCs w:val="20"/>
         </w:rPr>
-        <w:t xml:space="preserve">1.3  </w:t>
+        <w:t xml:space="preserve">1.2  </w:t>
       </w:r>
       <w:r>
         <w:rPr>
           <w:sz w:val="20"/>
           <w:szCs w:val="20"/>
         </w:rPr>
-        <w:t>Task</w:t>
+        <w:t>Project</w:t>
       </w:r>
       <w:proofErr w:type="gramEnd"/>
       <w:r>
@@ -1672,7 +1391,7 @@
           <w:sz w:val="20"/>
           <w:szCs w:val="20"/>
         </w:rPr>
-        <w:t xml:space="preserve"> Assignment &amp; Roles</w:t>
+        <w:t xml:space="preserve"> Plan &amp; Timeline</w:t>
       </w:r>
     </w:p>
     <w:p>
@@ -1687,14 +1406,14 @@
           <w:sz w:val="20"/>
           <w:szCs w:val="20"/>
         </w:rPr>
-        <w:t xml:space="preserve">1.4  </w:t>
+        <w:t xml:space="preserve">1.3  </w:t>
       </w:r>
       <w:r>
         <w:rPr>
           <w:sz w:val="20"/>
           <w:szCs w:val="20"/>
         </w:rPr>
-        <w:t>Risk</w:t>
+        <w:t>Task</w:t>
       </w:r>
       <w:proofErr w:type="gramEnd"/>
       <w:r>
@@ -1702,7 +1421,7 @@
           <w:sz w:val="20"/>
           <w:szCs w:val="20"/>
         </w:rPr>
-        <w:t xml:space="preserve"> Assessment &amp; Mitigation Plan</w:t>
+        <w:t xml:space="preserve"> Assignment &amp; Roles</w:t>
       </w:r>
     </w:p>
     <w:p>
@@ -1717,14 +1436,14 @@
           <w:sz w:val="20"/>
           <w:szCs w:val="20"/>
         </w:rPr>
-        <w:t xml:space="preserve">1.5  </w:t>
+        <w:t xml:space="preserve">1.4  </w:t>
       </w:r>
       <w:r>
         <w:rPr>
           <w:sz w:val="20"/>
           <w:szCs w:val="20"/>
         </w:rPr>
-        <w:t>Key</w:t>
+        <w:t>Risk</w:t>
       </w:r>
       <w:proofErr w:type="gramEnd"/>
       <w:r>
@@ -1732,44 +1451,7 @@
           <w:sz w:val="20"/>
           <w:szCs w:val="20"/>
         </w:rPr>
-        <w:t xml:space="preserve"> Performance Indicators (KPIs)</w:t>
-      </w:r>
-    </w:p>
-    <w:p>
-      <w:pPr>
-        <w:spacing w:before="160" w:after="140"/>
-      </w:pPr>
-      <w:r>
-        <w:rPr>
-          <w:b/>
-          <w:bCs/>
-          <w:color w:val="0B3D2E"/>
-          <w:sz w:val="24"/>
-          <w:szCs w:val="24"/>
-        </w:rPr>
-        <w:t>2</w:t>
-      </w:r>
-      <w:proofErr w:type="gramStart"/>
-      <w:r>
-        <w:rPr>
-          <w:b/>
-          <w:bCs/>
-          <w:color w:val="0B3D2E"/>
-          <w:sz w:val="24"/>
-          <w:szCs w:val="24"/>
-        </w:rPr>
-        <w:t>.  Requirements</w:t>
-      </w:r>
-      <w:proofErr w:type="gramEnd"/>
-      <w:r>
-        <w:rPr>
-          <w:b/>
-          <w:bCs/>
-          <w:color w:val="0B3D2E"/>
-          <w:sz w:val="24"/>
-          <w:szCs w:val="24"/>
-        </w:rPr>
-        <w:t xml:space="preserve"> Gathering &amp; Stakeholder Analysis</w:t>
+        <w:t xml:space="preserve"> Assessment &amp; Mitigation Plan</w:t>
       </w:r>
     </w:p>
     <w:p>
@@ -1784,14 +1466,14 @@
           <w:sz w:val="20"/>
           <w:szCs w:val="20"/>
         </w:rPr>
-        <w:t xml:space="preserve">2.1  </w:t>
+        <w:t xml:space="preserve">1.5  </w:t>
       </w:r>
       <w:r>
         <w:rPr>
           <w:sz w:val="20"/>
           <w:szCs w:val="20"/>
         </w:rPr>
-        <w:t>Stakeholder</w:t>
+        <w:t>Key</w:t>
       </w:r>
       <w:proofErr w:type="gramEnd"/>
       <w:r>
@@ -1799,7 +1481,44 @@
           <w:sz w:val="20"/>
           <w:szCs w:val="20"/>
         </w:rPr>
-        <w:t xml:space="preserve"> Analysis</w:t>
+        <w:t xml:space="preserve"> Performance Indicators (KPIs)</w:t>
+      </w:r>
+    </w:p>
+    <w:p>
+      <w:pPr>
+        <w:spacing w:before="160" w:after="140"/>
+      </w:pPr>
+      <w:r>
+        <w:rPr>
+          <w:b/>
+          <w:bCs/>
+          <w:color w:val="0B3D2E"/>
+          <w:sz w:val="24"/>
+          <w:szCs w:val="24"/>
+        </w:rPr>
+        <w:t>2</w:t>
+      </w:r>
+      <w:proofErr w:type="gramStart"/>
+      <w:r>
+        <w:rPr>
+          <w:b/>
+          <w:bCs/>
+          <w:color w:val="0B3D2E"/>
+          <w:sz w:val="24"/>
+          <w:szCs w:val="24"/>
+        </w:rPr>
+        <w:t>.  Requirements</w:t>
+      </w:r>
+      <w:proofErr w:type="gramEnd"/>
+      <w:r>
+        <w:rPr>
+          <w:b/>
+          <w:bCs/>
+          <w:color w:val="0B3D2E"/>
+          <w:sz w:val="24"/>
+          <w:szCs w:val="24"/>
+        </w:rPr>
+        <w:t xml:space="preserve"> Gathering &amp; Stakeholder Analysis</w:t>
       </w:r>
     </w:p>
     <w:p>
@@ -1814,14 +1533,14 @@
           <w:sz w:val="20"/>
           <w:szCs w:val="20"/>
         </w:rPr>
-        <w:t xml:space="preserve">2.2  </w:t>
+        <w:t xml:space="preserve">2.1  </w:t>
       </w:r>
       <w:r>
         <w:rPr>
           <w:sz w:val="20"/>
           <w:szCs w:val="20"/>
         </w:rPr>
-        <w:t>User</w:t>
+        <w:t>Stakeholder</w:t>
       </w:r>
       <w:proofErr w:type="gramEnd"/>
       <w:r>
@@ -1829,7 +1548,7 @@
           <w:sz w:val="20"/>
           <w:szCs w:val="20"/>
         </w:rPr>
-        <w:t xml:space="preserve"> Stories &amp; Use Cases</w:t>
+        <w:t xml:space="preserve"> Analysis</w:t>
       </w:r>
     </w:p>
     <w:p>
@@ -1844,14 +1563,14 @@
           <w:sz w:val="20"/>
           <w:szCs w:val="20"/>
         </w:rPr>
-        <w:t xml:space="preserve">2.3  </w:t>
+        <w:t xml:space="preserve">2.2  </w:t>
       </w:r>
       <w:r>
         <w:rPr>
           <w:sz w:val="20"/>
           <w:szCs w:val="20"/>
         </w:rPr>
-        <w:t>Functional</w:t>
+        <w:t>User</w:t>
       </w:r>
       <w:proofErr w:type="gramEnd"/>
       <w:r>
@@ -1859,7 +1578,7 @@
           <w:sz w:val="20"/>
           <w:szCs w:val="20"/>
         </w:rPr>
-        <w:t xml:space="preserve"> Requirements</w:t>
+        <w:t xml:space="preserve"> Stories &amp; Use Cases</w:t>
       </w:r>
     </w:p>
     <w:p>
@@ -1874,14 +1593,14 @@
           <w:sz w:val="20"/>
           <w:szCs w:val="20"/>
         </w:rPr>
-        <w:t xml:space="preserve">2.4  </w:t>
+        <w:t xml:space="preserve">2.3  </w:t>
       </w:r>
       <w:r>
         <w:rPr>
           <w:sz w:val="20"/>
           <w:szCs w:val="20"/>
         </w:rPr>
-        <w:t>Non</w:t>
+        <w:t>Functional</w:t>
       </w:r>
       <w:proofErr w:type="gramEnd"/>
       <w:r>
@@ -1889,44 +1608,7 @@
           <w:sz w:val="20"/>
           <w:szCs w:val="20"/>
         </w:rPr>
-        <w:t>-Functional Requirements</w:t>
-      </w:r>
-    </w:p>
-    <w:p>
-      <w:pPr>
-        <w:spacing w:before="160" w:after="140"/>
-      </w:pPr>
-      <w:r>
-        <w:rPr>
-          <w:b/>
-          <w:bCs/>
-          <w:color w:val="0B3D2E"/>
-          <w:sz w:val="24"/>
-          <w:szCs w:val="24"/>
-        </w:rPr>
-        <w:t>3</w:t>
-      </w:r>
-      <w:proofErr w:type="gramStart"/>
-      <w:r>
-        <w:rPr>
-          <w:b/>
-          <w:bCs/>
-          <w:color w:val="0B3D2E"/>
-          <w:sz w:val="24"/>
-          <w:szCs w:val="24"/>
-        </w:rPr>
-        <w:t>.  System</w:t>
-      </w:r>
-      <w:proofErr w:type="gramEnd"/>
-      <w:r>
-        <w:rPr>
-          <w:b/>
-          <w:bCs/>
-          <w:color w:val="0B3D2E"/>
-          <w:sz w:val="24"/>
-          <w:szCs w:val="24"/>
-        </w:rPr>
-        <w:t xml:space="preserve"> Analysis &amp; Design</w:t>
+        <w:t xml:space="preserve"> Requirements</w:t>
       </w:r>
     </w:p>
     <w:p>
@@ -1941,14 +1623,14 @@
           <w:sz w:val="20"/>
           <w:szCs w:val="20"/>
         </w:rPr>
-        <w:t xml:space="preserve">3.1  </w:t>
+        <w:t xml:space="preserve">2.4  </w:t>
       </w:r>
       <w:r>
         <w:rPr>
           <w:sz w:val="20"/>
           <w:szCs w:val="20"/>
         </w:rPr>
-        <w:t>Problem</w:t>
+        <w:t>Non</w:t>
       </w:r>
       <w:proofErr w:type="gramEnd"/>
       <w:r>
@@ -1956,7 +1638,44 @@
           <w:sz w:val="20"/>
           <w:szCs w:val="20"/>
         </w:rPr>
-        <w:t xml:space="preserve"> Statement &amp; Architecture</w:t>
+        <w:t>-Functional Requirements</w:t>
+      </w:r>
+    </w:p>
+    <w:p>
+      <w:pPr>
+        <w:spacing w:before="160" w:after="140"/>
+      </w:pPr>
+      <w:r>
+        <w:rPr>
+          <w:b/>
+          <w:bCs/>
+          <w:color w:val="0B3D2E"/>
+          <w:sz w:val="24"/>
+          <w:szCs w:val="24"/>
+        </w:rPr>
+        <w:t>3</w:t>
+      </w:r>
+      <w:proofErr w:type="gramStart"/>
+      <w:r>
+        <w:rPr>
+          <w:b/>
+          <w:bCs/>
+          <w:color w:val="0B3D2E"/>
+          <w:sz w:val="24"/>
+          <w:szCs w:val="24"/>
+        </w:rPr>
+        <w:t>.  System</w:t>
+      </w:r>
+      <w:proofErr w:type="gramEnd"/>
+      <w:r>
+        <w:rPr>
+          <w:b/>
+          <w:bCs/>
+          <w:color w:val="0B3D2E"/>
+          <w:sz w:val="24"/>
+          <w:szCs w:val="24"/>
+        </w:rPr>
+        <w:t xml:space="preserve"> Analysis &amp; Design</w:t>
       </w:r>
     </w:p>
     <w:p>
@@ -1971,14 +1690,14 @@
           <w:sz w:val="20"/>
           <w:szCs w:val="20"/>
         </w:rPr>
-        <w:t xml:space="preserve">3.2  </w:t>
+        <w:t xml:space="preserve">3.1  </w:t>
       </w:r>
       <w:r>
         <w:rPr>
           <w:sz w:val="20"/>
           <w:szCs w:val="20"/>
         </w:rPr>
-        <w:t>Database</w:t>
+        <w:t>Problem</w:t>
       </w:r>
       <w:proofErr w:type="gramEnd"/>
       <w:r>
@@ -1986,7 +1705,7 @@
           <w:sz w:val="20"/>
           <w:szCs w:val="20"/>
         </w:rPr>
-        <w:t xml:space="preserve"> Design &amp; ER Diagram</w:t>
+        <w:t xml:space="preserve"> Statement &amp; Architecture</w:t>
       </w:r>
     </w:p>
     <w:p>
@@ -2001,14 +1720,14 @@
           <w:sz w:val="20"/>
           <w:szCs w:val="20"/>
         </w:rPr>
-        <w:t xml:space="preserve">3.3  </w:t>
+        <w:t xml:space="preserve">3.2  </w:t>
       </w:r>
       <w:r>
         <w:rPr>
           <w:sz w:val="20"/>
           <w:szCs w:val="20"/>
         </w:rPr>
-        <w:t>Data</w:t>
+        <w:t>Database</w:t>
       </w:r>
       <w:proofErr w:type="gramEnd"/>
       <w:r>
@@ -2016,44 +1735,7 @@
           <w:sz w:val="20"/>
           <w:szCs w:val="20"/>
         </w:rPr>
-        <w:t xml:space="preserve"> Flow &amp; System Behavior</w:t>
-      </w:r>
-    </w:p>
-    <w:p>
-      <w:pPr>
-        <w:spacing w:before="160" w:after="140"/>
-      </w:pPr>
-      <w:r>
-        <w:rPr>
-          <w:b/>
-          <w:bCs/>
-          <w:color w:val="0B3D2E"/>
-          <w:sz w:val="24"/>
-          <w:szCs w:val="24"/>
-        </w:rPr>
-        <w:t>4</w:t>
-      </w:r>
-      <w:proofErr w:type="gramStart"/>
-      <w:r>
-        <w:rPr>
-          <w:b/>
-          <w:bCs/>
-          <w:color w:val="0B3D2E"/>
-          <w:sz w:val="24"/>
-          <w:szCs w:val="24"/>
-        </w:rPr>
-        <w:t>.  Implementation</w:t>
-      </w:r>
-      <w:proofErr w:type="gramEnd"/>
-      <w:r>
-        <w:rPr>
-          <w:b/>
-          <w:bCs/>
-          <w:color w:val="0B3D2E"/>
-          <w:sz w:val="24"/>
-          <w:szCs w:val="24"/>
-        </w:rPr>
-        <w:t xml:space="preserve"> &amp; Version Control</w:t>
+        <w:t xml:space="preserve"> Design &amp; ER Diagram</w:t>
       </w:r>
     </w:p>
     <w:p>
@@ -2068,14 +1750,14 @@
           <w:sz w:val="20"/>
           <w:szCs w:val="20"/>
         </w:rPr>
-        <w:t xml:space="preserve">4.1  </w:t>
+        <w:t xml:space="preserve">3.3  </w:t>
       </w:r>
       <w:r>
         <w:rPr>
           <w:sz w:val="20"/>
           <w:szCs w:val="20"/>
         </w:rPr>
-        <w:t>Coding</w:t>
+        <w:t>Data</w:t>
       </w:r>
       <w:proofErr w:type="gramEnd"/>
       <w:r>
@@ -2083,7 +1765,44 @@
           <w:sz w:val="20"/>
           <w:szCs w:val="20"/>
         </w:rPr>
-        <w:t xml:space="preserve"> Standards</w:t>
+        <w:t xml:space="preserve"> Flow &amp; System Behavior</w:t>
+      </w:r>
+    </w:p>
+    <w:p>
+      <w:pPr>
+        <w:spacing w:before="160" w:after="140"/>
+      </w:pPr>
+      <w:r>
+        <w:rPr>
+          <w:b/>
+          <w:bCs/>
+          <w:color w:val="0B3D2E"/>
+          <w:sz w:val="24"/>
+          <w:szCs w:val="24"/>
+        </w:rPr>
+        <w:t>4</w:t>
+      </w:r>
+      <w:proofErr w:type="gramStart"/>
+      <w:r>
+        <w:rPr>
+          <w:b/>
+          <w:bCs/>
+          <w:color w:val="0B3D2E"/>
+          <w:sz w:val="24"/>
+          <w:szCs w:val="24"/>
+        </w:rPr>
+        <w:t>.  Implementation</w:t>
+      </w:r>
+      <w:proofErr w:type="gramEnd"/>
+      <w:r>
+        <w:rPr>
+          <w:b/>
+          <w:bCs/>
+          <w:color w:val="0B3D2E"/>
+          <w:sz w:val="24"/>
+          <w:szCs w:val="24"/>
+        </w:rPr>
+        <w:t xml:space="preserve"> &amp; Version Control</w:t>
       </w:r>
     </w:p>
     <w:p>
@@ -2098,14 +1817,14 @@
           <w:sz w:val="20"/>
           <w:szCs w:val="20"/>
         </w:rPr>
-        <w:t xml:space="preserve">4.2  </w:t>
+        <w:t xml:space="preserve">4.1  </w:t>
       </w:r>
       <w:r>
         <w:rPr>
           <w:sz w:val="20"/>
           <w:szCs w:val="20"/>
         </w:rPr>
-        <w:t>Modular</w:t>
+        <w:t>Coding</w:t>
       </w:r>
       <w:proofErr w:type="gramEnd"/>
       <w:r>
@@ -2113,7 +1832,7 @@
           <w:sz w:val="20"/>
           <w:szCs w:val="20"/>
         </w:rPr>
-        <w:t xml:space="preserve"> Code &amp; Reusability</w:t>
+        <w:t xml:space="preserve"> Standards</w:t>
       </w:r>
     </w:p>
     <w:p>
@@ -2128,14 +1847,14 @@
           <w:sz w:val="20"/>
           <w:szCs w:val="20"/>
         </w:rPr>
-        <w:t xml:space="preserve">4.3  </w:t>
+        <w:t xml:space="preserve">4.2  </w:t>
       </w:r>
       <w:r>
         <w:rPr>
           <w:sz w:val="20"/>
           <w:szCs w:val="20"/>
         </w:rPr>
-        <w:t>Security</w:t>
+        <w:t>Modular</w:t>
       </w:r>
       <w:proofErr w:type="gramEnd"/>
       <w:r>
@@ -2143,7 +1862,7 @@
           <w:sz w:val="20"/>
           <w:szCs w:val="20"/>
         </w:rPr>
-        <w:t xml:space="preserve"> &amp; Error Handling</w:t>
+        <w:t xml:space="preserve"> Code &amp; Reusability</w:t>
       </w:r>
     </w:p>
     <w:p>
@@ -2158,14 +1877,14 @@
           <w:sz w:val="20"/>
           <w:szCs w:val="20"/>
         </w:rPr>
-        <w:t xml:space="preserve">4.4  </w:t>
+        <w:t xml:space="preserve">4.3  </w:t>
       </w:r>
       <w:r>
         <w:rPr>
           <w:sz w:val="20"/>
           <w:szCs w:val="20"/>
         </w:rPr>
-        <w:t>Version</w:t>
+        <w:t>Security</w:t>
       </w:r>
       <w:proofErr w:type="gramEnd"/>
       <w:r>
@@ -2173,44 +1892,7 @@
           <w:sz w:val="20"/>
           <w:szCs w:val="20"/>
         </w:rPr>
-        <w:t xml:space="preserve"> Control Strategy</w:t>
-      </w:r>
-    </w:p>
-    <w:p>
-      <w:pPr>
-        <w:spacing w:before="160" w:after="140"/>
-      </w:pPr>
-      <w:r>
-        <w:rPr>
-          <w:b/>
-          <w:bCs/>
-          <w:color w:val="0B3D2E"/>
-          <w:sz w:val="24"/>
-          <w:szCs w:val="24"/>
-        </w:rPr>
-        <w:t>5</w:t>
-      </w:r>
-      <w:proofErr w:type="gramStart"/>
-      <w:r>
-        <w:rPr>
-          <w:b/>
-          <w:bCs/>
-          <w:color w:val="0B3D2E"/>
-          <w:sz w:val="24"/>
-          <w:szCs w:val="24"/>
-        </w:rPr>
-        <w:t>.  Testing</w:t>
-      </w:r>
-      <w:proofErr w:type="gramEnd"/>
-      <w:r>
-        <w:rPr>
-          <w:b/>
-          <w:bCs/>
-          <w:color w:val="0B3D2E"/>
-          <w:sz w:val="24"/>
-          <w:szCs w:val="24"/>
-        </w:rPr>
-        <w:t xml:space="preserve"> &amp; Quality Assurance</w:t>
+        <w:t xml:space="preserve"> &amp; Error Handling</w:t>
       </w:r>
     </w:p>
     <w:p>
@@ -2225,14 +1907,14 @@
           <w:sz w:val="20"/>
           <w:szCs w:val="20"/>
         </w:rPr>
-        <w:t xml:space="preserve">5.1  </w:t>
+        <w:t xml:space="preserve">4.4  </w:t>
       </w:r>
       <w:r>
         <w:rPr>
           <w:sz w:val="20"/>
           <w:szCs w:val="20"/>
         </w:rPr>
-        <w:t>Test</w:t>
+        <w:t>Version</w:t>
       </w:r>
       <w:proofErr w:type="gramEnd"/>
       <w:r>
@@ -2240,7 +1922,44 @@
           <w:sz w:val="20"/>
           <w:szCs w:val="20"/>
         </w:rPr>
-        <w:t xml:space="preserve"> Plan &amp; Scenarios</w:t>
+        <w:t xml:space="preserve"> Control Strategy</w:t>
+      </w:r>
+    </w:p>
+    <w:p>
+      <w:pPr>
+        <w:spacing w:before="160" w:after="140"/>
+      </w:pPr>
+      <w:r>
+        <w:rPr>
+          <w:b/>
+          <w:bCs/>
+          <w:color w:val="0B3D2E"/>
+          <w:sz w:val="24"/>
+          <w:szCs w:val="24"/>
+        </w:rPr>
+        <w:t>5</w:t>
+      </w:r>
+      <w:proofErr w:type="gramStart"/>
+      <w:r>
+        <w:rPr>
+          <w:b/>
+          <w:bCs/>
+          <w:color w:val="0B3D2E"/>
+          <w:sz w:val="24"/>
+          <w:szCs w:val="24"/>
+        </w:rPr>
+        <w:t>.  Testing</w:t>
+      </w:r>
+      <w:proofErr w:type="gramEnd"/>
+      <w:r>
+        <w:rPr>
+          <w:b/>
+          <w:bCs/>
+          <w:color w:val="0B3D2E"/>
+          <w:sz w:val="24"/>
+          <w:szCs w:val="24"/>
+        </w:rPr>
+        <w:t xml:space="preserve"> &amp; Quality Assurance</w:t>
       </w:r>
     </w:p>
     <w:p>
@@ -2255,14 +1974,14 @@
           <w:sz w:val="20"/>
           <w:szCs w:val="20"/>
         </w:rPr>
-        <w:t xml:space="preserve">5.2  </w:t>
+        <w:t xml:space="preserve">5.1  </w:t>
       </w:r>
       <w:r>
         <w:rPr>
           <w:sz w:val="20"/>
           <w:szCs w:val="20"/>
         </w:rPr>
-        <w:t>Automated</w:t>
+        <w:t>Test</w:t>
       </w:r>
       <w:proofErr w:type="gramEnd"/>
       <w:r>
@@ -2270,7 +1989,7 @@
           <w:sz w:val="20"/>
           <w:szCs w:val="20"/>
         </w:rPr>
-        <w:t xml:space="preserve"> Testing</w:t>
+        <w:t xml:space="preserve"> Plan &amp; Scenarios</w:t>
       </w:r>
     </w:p>
     <w:p>
@@ -2285,14 +2004,14 @@
           <w:sz w:val="20"/>
           <w:szCs w:val="20"/>
         </w:rPr>
-        <w:t xml:space="preserve">5.3  </w:t>
+        <w:t xml:space="preserve">5.2  </w:t>
       </w:r>
       <w:r>
         <w:rPr>
           <w:sz w:val="20"/>
           <w:szCs w:val="20"/>
         </w:rPr>
-        <w:t>Bug</w:t>
+        <w:t>Automated</w:t>
       </w:r>
       <w:proofErr w:type="gramEnd"/>
       <w:r>
@@ -2300,44 +2019,7 @@
           <w:sz w:val="20"/>
           <w:szCs w:val="20"/>
         </w:rPr>
-        <w:t xml:space="preserve"> Reports &amp; Resolutions</w:t>
-      </w:r>
-    </w:p>
-    <w:p>
-      <w:pPr>
-        <w:spacing w:before="160" w:after="140"/>
-      </w:pPr>
-      <w:r>
-        <w:rPr>
-          <w:b/>
-          <w:bCs/>
-          <w:color w:val="0B3D2E"/>
-          <w:sz w:val="24"/>
-          <w:szCs w:val="24"/>
-        </w:rPr>
-        <w:t>6</w:t>
-      </w:r>
-      <w:proofErr w:type="gramStart"/>
-      <w:r>
-        <w:rPr>
-          <w:b/>
-          <w:bCs/>
-          <w:color w:val="0B3D2E"/>
-          <w:sz w:val="24"/>
-          <w:szCs w:val="24"/>
-        </w:rPr>
-        <w:t>.  User</w:t>
-      </w:r>
-      <w:proofErr w:type="gramEnd"/>
-      <w:r>
-        <w:rPr>
-          <w:b/>
-          <w:bCs/>
-          <w:color w:val="0B3D2E"/>
-          <w:sz w:val="24"/>
-          <w:szCs w:val="24"/>
-        </w:rPr>
-        <w:t xml:space="preserve"> Manual &amp; Deployment Guide</w:t>
+        <w:t xml:space="preserve"> Testing</w:t>
       </w:r>
     </w:p>
     <w:p>
@@ -2352,14 +2034,14 @@
           <w:sz w:val="20"/>
           <w:szCs w:val="20"/>
         </w:rPr>
-        <w:t xml:space="preserve">6.1  </w:t>
+        <w:t xml:space="preserve">5.3  </w:t>
       </w:r>
       <w:r>
         <w:rPr>
           <w:sz w:val="20"/>
           <w:szCs w:val="20"/>
         </w:rPr>
-        <w:t>System</w:t>
+        <w:t>Bug</w:t>
       </w:r>
       <w:proofErr w:type="gramEnd"/>
       <w:r>
@@ -2367,7 +2049,44 @@
           <w:sz w:val="20"/>
           <w:szCs w:val="20"/>
         </w:rPr>
-        <w:t xml:space="preserve"> Requirements</w:t>
+        <w:t xml:space="preserve"> Reports &amp; Resolutions</w:t>
+      </w:r>
+    </w:p>
+    <w:p>
+      <w:pPr>
+        <w:spacing w:before="160" w:after="140"/>
+      </w:pPr>
+      <w:r>
+        <w:rPr>
+          <w:b/>
+          <w:bCs/>
+          <w:color w:val="0B3D2E"/>
+          <w:sz w:val="24"/>
+          <w:szCs w:val="24"/>
+        </w:rPr>
+        <w:t>6</w:t>
+      </w:r>
+      <w:proofErr w:type="gramStart"/>
+      <w:r>
+        <w:rPr>
+          <w:b/>
+          <w:bCs/>
+          <w:color w:val="0B3D2E"/>
+          <w:sz w:val="24"/>
+          <w:szCs w:val="24"/>
+        </w:rPr>
+        <w:t>.  User</w:t>
+      </w:r>
+      <w:proofErr w:type="gramEnd"/>
+      <w:r>
+        <w:rPr>
+          <w:b/>
+          <w:bCs/>
+          <w:color w:val="0B3D2E"/>
+          <w:sz w:val="24"/>
+          <w:szCs w:val="24"/>
+        </w:rPr>
+        <w:t xml:space="preserve"> Manual &amp; Deployment Guide</w:t>
       </w:r>
     </w:p>
     <w:p>
@@ -2382,14 +2101,14 @@
           <w:sz w:val="20"/>
           <w:szCs w:val="20"/>
         </w:rPr>
-        <w:t xml:space="preserve">6.2  </w:t>
+        <w:t xml:space="preserve">6.1  </w:t>
       </w:r>
       <w:r>
         <w:rPr>
           <w:sz w:val="20"/>
           <w:szCs w:val="20"/>
         </w:rPr>
-        <w:t>Installation</w:t>
+        <w:t>System</w:t>
       </w:r>
       <w:proofErr w:type="gramEnd"/>
       <w:r>
@@ -2397,7 +2116,7 @@
           <w:sz w:val="20"/>
           <w:szCs w:val="20"/>
         </w:rPr>
-        <w:t xml:space="preserve"> Steps</w:t>
+        <w:t xml:space="preserve"> Requirements</w:t>
       </w:r>
     </w:p>
     <w:p>
@@ -2412,14 +2131,14 @@
           <w:sz w:val="20"/>
           <w:szCs w:val="20"/>
         </w:rPr>
-        <w:t xml:space="preserve">6.3  </w:t>
+        <w:t xml:space="preserve">6.2  </w:t>
       </w:r>
       <w:r>
         <w:rPr>
           <w:sz w:val="20"/>
           <w:szCs w:val="20"/>
         </w:rPr>
-        <w:t>Execution</w:t>
+        <w:t>Installation</w:t>
       </w:r>
       <w:proofErr w:type="gramEnd"/>
       <w:r>
@@ -2427,7 +2146,7 @@
           <w:sz w:val="20"/>
           <w:szCs w:val="20"/>
         </w:rPr>
-        <w:t xml:space="preserve"> Guide</w:t>
+        <w:t xml:space="preserve"> Steps</w:t>
       </w:r>
     </w:p>
     <w:p>
@@ -2442,14 +2161,14 @@
           <w:sz w:val="20"/>
           <w:szCs w:val="20"/>
         </w:rPr>
-        <w:t xml:space="preserve">6.4  </w:t>
+        <w:t xml:space="preserve">6.3  </w:t>
       </w:r>
       <w:r>
         <w:rPr>
           <w:sz w:val="20"/>
           <w:szCs w:val="20"/>
         </w:rPr>
-        <w:t>End</w:t>
+        <w:t>Execution</w:t>
       </w:r>
       <w:proofErr w:type="gramEnd"/>
       <w:r>
@@ -2457,7 +2176,42 @@
           <w:sz w:val="20"/>
           <w:szCs w:val="20"/>
         </w:rPr>
+        <w:t xml:space="preserve"> Guide</w:t>
+      </w:r>
+    </w:p>
+    <w:p>
+      <w:pPr>
+        <w:spacing w:after="80"/>
+        <w:ind w:left="360"/>
+      </w:pPr>
+      <w:proofErr w:type="gramStart"/>
+      <w:r>
+        <w:rPr>
+          <w:color w:val="555555"/>
+          <w:sz w:val="20"/>
+          <w:szCs w:val="20"/>
+        </w:rPr>
+        <w:t xml:space="preserve">6.4  </w:t>
+      </w:r>
+      <w:r>
+        <w:rPr>
+          <w:sz w:val="20"/>
+          <w:szCs w:val="20"/>
+        </w:rPr>
+        <w:t>End</w:t>
+      </w:r>
+      <w:proofErr w:type="gramEnd"/>
+      <w:r>
+        <w:rPr>
+          <w:sz w:val="20"/>
+          <w:szCs w:val="20"/>
+        </w:rPr>
         <w:t xml:space="preserve"> User Manual</w:t>
+      </w:r>
+    </w:p>
+    <w:p>
+      <w:r>
+        <w:t>Live Streamlit Application URL: https://carbon-heist-mitigation.streamlit.app/ — Access all 5 analytical tabs, real-time KPI cards, and the interactive AI Co-Pilot online without local setup.</w:t>
       </w:r>
     </w:p>
     <w:p>

</xml_diff>

<commit_message>
Standardize and pair AI Chatbot badge with live Streamlit app badge pointing to exact unified platform link across all Docs, Folder READMEs, and master Word docx
</commit_message>
<xml_diff>
--- a/Project Documentations/Carbon_Heist_Mitigation_Documentation.docx
+++ b/Project Documentations/Carbon_Heist_Mitigation_Documentation.docx
@@ -51,7 +51,9 @@
               <w:br/>
               <w:t>Repository:  github.com/ahmedadelamin/carbon-heist-mitigation</w:t>
               <w:br/>
-              <w:t>Live Streamlit App:  https://carbon-heist-mitigation.streamlit.app/</w:t>
+              <w:t>Live Streamlit App &amp; AI Chatbot:  https://carbon-heist-mitigation.streamlit.app/</w:t>
+              <w:br/>
+              <w:t>(Note: Both the 5-Tab Dashboard and the Dual-Engine AI Chatbot are hosted on this single unified platform URL)</w:t>
               <w:br/>
               <w:t>Version:  v1.0   |   July 2026</w:t>
             </w:r>
@@ -1361,7 +1363,7 @@
     </w:p>
     <w:p>
       <w:r>
-        <w:t>Live C-Suite Executive Streamlit Dashboard: https://carbon-heist-mitigation.streamlit.app/ (Access real-time portfolio emissions analysis, 5-playbook simulation, ML risk inference, and Tab 5 Dual-Engine AI Chatbot directly online).</w:t>
+        <w:t>Live Streamlit Dashboard &amp; AI Chatbot URL: https://carbon-heist-mitigation.streamlit.app/ (Both the 5-Tab Dashboard and the Dual-Engine AI Chatbot are hosted on this exact same live platform link) (Access real-time portfolio emissions analysis, 5-playbook simulation, ML risk inference, and Tab 5 Dual-Engine AI Chatbot directly online).</w:t>
       </w:r>
     </w:p>
     <w:p>
@@ -2211,7 +2213,7 @@
     </w:p>
     <w:p>
       <w:r>
-        <w:t>Live Streamlit Application URL: https://carbon-heist-mitigation.streamlit.app/ — Access all 5 analytical tabs, real-time KPI cards, and the interactive AI Co-Pilot online without local setup.</w:t>
+        <w:t>Live Streamlit Dashboard &amp; AI Chatbot URL: https://carbon-heist-mitigation.streamlit.app/ — Access all 5 analytical tabs including Tab 5 (AI Chatbot) online on this single URL without local setup — Access all 5 analytical tabs, real-time KPI cards, and the interactive AI Co-Pilot online without local setup.</w:t>
       </w:r>
     </w:p>
     <w:p>

</xml_diff>

<commit_message>
Finalize and verify master Word docx: ensure strict chronological User Manual step order (1-4), 16 sheets, Tab 5 AI Chatbot, US-05, UC-05, FR-07, TC-08, TC-09, and unified Streamlit app link
</commit_message>
<xml_diff>
--- a/Project Documentations/Carbon_Heist_Mitigation_Documentation.docx
+++ b/Project Documentations/Carbon_Heist_Mitigation_Documentation.docx
@@ -1363,7 +1363,9 @@
     </w:p>
     <w:p>
       <w:r>
-        <w:t>Live Streamlit Dashboard &amp; AI Chatbot URL: https://carbon-heist-mitigation.streamlit.app/ (Both the 5-Tab Dashboard and the Dual-Engine AI Chatbot are hosted on this exact same live platform link) (Access real-time portfolio emissions analysis, 5-playbook simulation, ML risk inference, and Tab 5 Dual-Engine AI Chatbot directly online).</w:t>
+        <w:t>Live C-Suite Executive Streamlit Dashboard &amp; AI Chatbot URL: https://carbon-heist-mitigation.streamlit.app/</w:t>
+        <w:br/>
+        <w:t>(Access real-time portfolio emissions analysis, 5-playbook simulation, ML risk inference, and Tab 5 Dual-Engine AI Chatbot directly online across our 5 analytical tabs).</w:t>
       </w:r>
     </w:p>
     <w:p>
@@ -2213,7 +2215,9 @@
     </w:p>
     <w:p>
       <w:r>
-        <w:t>Live Streamlit Dashboard &amp; AI Chatbot URL: https://carbon-heist-mitigation.streamlit.app/ — Access all 5 analytical tabs including Tab 5 (AI Chatbot) online on this single URL without local setup — Access all 5 analytical tabs, real-time KPI cards, and the interactive AI Co-Pilot online without local setup.</w:t>
+        <w:t>Live Streamlit Dashboard &amp; AI Chatbot URL: https://carbon-heist-mitigation.streamlit.app/</w:t>
+        <w:br/>
+        <w:t>(Access all 5 analytical tabs, real-time KPI cards, and the interactive AI Co-Pilot online without local setup).</w:t>
       </w:r>
     </w:p>
     <w:p>
@@ -15598,7 +15602,7 @@
     </w:p>
     <w:p>
       <w:r>
-        <w:t>Step 4 – Tab 5 AI Chatbot: Ask natural-language strategic questions in English or Arabic to dynamically generate custom interactive Plotly charts and quantitative audits (Dual-Engine: Gemini 2.5 Flash + Local Fallback).</w:t>
+        <w:t>Step 3 – Tab 2 &amp; Tab 4 Simulation: Model HVAC retro-commissioning, envelope insulation, and electrification upgrades across the 5 Decarbonization Playbooks.</w:t>
       </w:r>
     </w:p>
     <w:p>
@@ -15611,7 +15615,7 @@
         <w:spacing w:after="100" w:line="280" w:lineRule="auto"/>
       </w:pPr>
       <w:r>
-        <w:t>Step 3 – Tab 2 &amp; Tab 4 Simulation: Model HVAC retro-commissioning, envelope insulation, and electrification upgrades across the 5 Decarbonization Playbooks.</w:t>
+        <w:t>Step 4 – Tab 5 AI Chatbot: Ask natural-language strategic questions in English or Arabic to dynamically generate custom interactive Plotly charts and quantitative audits (Dual-Engine: Gemini 2.5 Flash + Local Fallback).</w:t>
       </w:r>
     </w:p>
     <w:p>

</xml_diff>

<commit_message>
docs: fully integrate Tableau BI Portal across all 6 academic deliverables, README, and Word docx
</commit_message>
<xml_diff>
--- a/Project Documentations/Carbon_Heist_Mitigation_Documentation.docx
+++ b/Project Documentations/Carbon_Heist_Mitigation_Documentation.docx
@@ -15913,6 +15913,65 @@
           <w:szCs w:val="19"/>
         </w:rPr>
         <w:t xml:space="preserve">  July 2026</w:t>
+      </w:r>
+    </w:p>
+    <w:p>
+      <w:r>
+        <w:rPr>
+          <w:b/>
+          <w:color w:val="0D1321"/>
+          <w:sz w:val="32"/>
+        </w:rPr>
+        <w:t>5.6 Tableau Executive BI Portal &amp; C-Suite Visual Analytics</w:t>
+      </w:r>
+    </w:p>
+    <w:p>
+      <w:r>
+        <w:t>To complement the 16-sheet Excel financial model and the live Streamlit application, the project suite integrates a standalone 3-Page Tableau Executive Business Intelligence Portal (Interactive Dashboard.twbx). Designed with a high-contrast Royal Navy &amp; Golden aesthetic (#0D1321 / #FFD700), it bridges macro geographical trends with building-level financial fine liabilities.</w:t>
+      </w:r>
+    </w:p>
+    <w:p>
+      <w:r>
+        <w:rPr>
+          <w:b/>
+        </w:rPr>
+        <w:t xml:space="preserve">• Page 1: NYC Energy Efficiency &amp; Emissions Monitor — </w:t>
+      </w:r>
+      <w:r>
+        <w:t>Establishes the macro footprint of NYC's greenhouse gas emissions across the five boroughs (9.05M Metric Tons CO2e), highlighting Manhattan (4.47M MT) and Brooklyn (1.61M MT) via horizontal bars, geographic choropleth maps, decade-built histograms, and area scatter plots.</w:t>
+      </w:r>
+    </w:p>
+    <w:p>
+      <w:r>
+        <w:rPr>
+          <w:b/>
+        </w:rPr>
+        <w:t xml:space="preserve">• Page 2: LL97 Compliance &amp; Carbon Performance — </w:t>
+      </w:r>
+      <w:r>
+        <w:t>Quantifies immediate financial fine exposure facing non-compliant properties ($2.43 Billion projected liabilities). It isolates top penalty buildings (e.g., Co-Op City at $0.04B/yr) and highlights Multifamily Housing ($1.20B+) and Commercial Offices ($0.40B+) as the core portfolio liabilities alongside a vertical compliance progress banner.</w:t>
+      </w:r>
+    </w:p>
+    <w:p>
+      <w:r>
+        <w:rPr>
+          <w:b/>
+        </w:rPr>
+        <w:t xml:space="preserve">• Page 3: Decarbonization Roadmap &amp; Live Mobile Bridge — </w:t>
+      </w:r>
+      <w:r>
+        <w:t>Delivers a concrete, 3-step self-funding engineering cascade (Energy Audit -&gt; Building Retrofit -&gt; Green Power Transition). It features detailed prescriptive solutions for LED/HVAC, building envelope insulation, and renewable energy, paired with an embedded mobile-scannable C-Suite QR Code Portal framed in crisp white (#FFFFFF) that allows executives to launch the live web interactive AI Co-Pilot directly from their smartphones.</w:t>
+      </w:r>
+    </w:p>
+    <w:p>
+      <w:r>
+        <w:rPr>
+          <w:b/>
+        </w:rPr>
+        <w:t xml:space="preserve">• Core Calculated Fields &amp; Strict Governance — </w:t>
+      </w:r>
+      <w:r>
+        <w:t>The workbook embeds specialized formulas including [LL97 Risk Category] (4-tier risk classification: Compliant, Moderate, High, Critical), [Penalty Savings Potential] (models a 45% fine reduction via Level 2 audits and basic retrofits), and [Total Records] anchoring exact property aggregations.</w:t>
       </w:r>
     </w:p>
     <w:p>

</xml_diff>

<commit_message>
docs: correct statutory fine formula to Total Emissions x  and eliminate all formatting and placement issues
</commit_message>
<xml_diff>
--- a/Project Documentations/Carbon_Heist_Mitigation_Documentation.docx
+++ b/Project Documentations/Carbon_Heist_Mitigation_Documentation.docx
@@ -2602,15 +2602,7 @@
               <w:spacing w:line="300" w:lineRule="auto"/>
             </w:pPr>
             <w:r>
-              <w:t xml:space="preserve">NYC's LL97 imposes strict carbon limits on buildings over 25,000 </w:t>
-            </w:r>
-            <w:proofErr w:type="spellStart"/>
-            <w:r>
-              <w:t>sq.ft</w:t>
-            </w:r>
-            <w:proofErr w:type="spellEnd"/>
-            <w:r>
-              <w:t>. starting 2024. Property owners exceeding thresholds face $268/MT CO2e annually. These fines can reach millions.</w:t>
+              <w:t>NYC's LL97 imposes strict carbon limits on buildings over 25,000 sq.ft. starting 2024. Property owners exceeding thresholds face $268/MT CO2e annually. These fines can reach millions.</w:t>
             </w:r>
           </w:p>
         </w:tc>

</xml_diff>

<commit_message>
Update Tableau workbook, waterfall steps CSV, and sync portfolio metrics across docs and Word report
</commit_message>
<xml_diff>
--- a/Project Documentations/Carbon_Heist_Mitigation_Documentation.docx
+++ b/Project Documentations/Carbon_Heist_Mitigation_Documentation.docx
@@ -138,7 +138,7 @@
     <w:p>
       <w:pPr/>
       <w:r>
-        <w:t>The following financial model details the portfolio-wide deployment of the 5 Strategic Decarbonization Playbooks across all 11,639 Local Law 97 audited properties, demonstrating initial CAPEX, itemized recurring Annual OPEX ($15.70M/yr total), Gross Annual Savings ($656.63M/yr), Net Annual Benefit ($640.93M/yr), and Payback horizons:</w:t>
+        <w:t>The following financial model details the portfolio-wide deployment of the 5 Strategic Decarbonization Playbooks across all 11,638 Local Law 97 audited properties, demonstrating initial CAPEX, itemized recurring Annual OPEX ($15.70M/yr total), Gross Annual Savings ($656.63M/yr), Net Annual Benefit ($640.93M/yr), and Payback horizons:</w:t>
       </w:r>
     </w:p>
     <w:tbl>
@@ -2368,7 +2368,7 @@
                 <w:sz w:val="30"/>
                 <w:szCs w:val="30"/>
               </w:rPr>
-              <w:t>11,639</w:t>
+              <w:t>11,638</w:t>
             </w:r>
           </w:p>
           <w:p>
@@ -5711,7 +5711,7 @@
                 <w:sz w:val="19"/>
                 <w:szCs w:val="19"/>
               </w:rPr>
-              <w:t>11,639 validated records with complete integrity.</w:t>
+              <w:t>11,638 validated records with complete integrity.</w:t>
             </w:r>
           </w:p>
         </w:tc>
@@ -7279,7 +7279,7 @@
           </w:tcPr>
           <w:p>
             <w:r>
-              <w:t>Query the 11,639-building portfolio via Tab 5 Dual-Engine AI Co-Pilot (Gemini 2.5 Flash + offline fallback) to receive instant natural-language insights and custom interactive Plotly charts.</w:t>
+              <w:t>Query the 11,638-building portfolio via Tab 5 Dual-Engine AI Co-Pilot (Gemini 2.5 Flash + offline fallback) to receive instant natural-language insights and custom interactive Plotly charts.</w:t>
             </w:r>
           </w:p>
         </w:tc>
@@ -11101,7 +11101,7 @@
                 <w:sz w:val="19"/>
                 <w:szCs w:val="19"/>
               </w:rPr>
-              <w:t>Save 11,639 clean records</w:t>
+              <w:t>Save 11,638 clean records</w:t>
             </w:r>
           </w:p>
         </w:tc>
@@ -13001,7 +13001,7 @@
                 <w:sz w:val="19"/>
                 <w:szCs w:val="19"/>
               </w:rPr>
-              <w:t>11,639 retained</w:t>
+              <w:t>11,638 retained</w:t>
             </w:r>
           </w:p>
         </w:tc>
@@ -15927,22 +15927,18 @@
         <w:rPr>
           <w:b/>
         </w:rPr>
-        <w:t xml:space="preserve">• Page 1: NYC Energy Efficiency &amp; Emissions Monitor — </w:t>
-      </w:r>
-      <w:r>
-        <w:t>Establishes the macro footprint of NYC's greenhouse gas emissions across the five boroughs (9.05M Metric Tons CO2e), highlighting Manhattan (4.47M MT) and Brooklyn (1.61M MT) via horizontal bars, geographic choropleth maps, decade-built histograms, and area scatter plots.</w:t>
-      </w:r>
+        <w:t>• Page 1: NYC Energy Efficiency &amp; Emissions Monitor — Establishes the macro footprint of NYC's greenhouse gas emissions across the five boroughs (10.56M Metric Tons CO2e), highlighting Manhattan (5.40M MT) and Brooklyn (1.75M MT) via horizontal bars, geographic choropleth maps, decade-built histograms, and area scatter plots.</w:t>
+      </w:r>
+      <w:r/>
     </w:p>
     <w:p>
       <w:r>
         <w:rPr>
           <w:b/>
         </w:rPr>
-        <w:t xml:space="preserve">• Page 2: LL97 Compliance &amp; Carbon Performance — </w:t>
-      </w:r>
-      <w:r>
-        <w:t>Quantifies immediate financial fine exposure facing non-compliant properties ($2.43 Billion projected liabilities). It isolates top penalty buildings (e.g., Co-Op City at $0.04B/yr) and highlights Multifamily Housing ($1.20B+) and Commercial Offices ($0.40B+) as the core portfolio liabilities alongside a vertical compliance progress banner.</w:t>
-      </w:r>
+        <w:t>• Page 2: LL97 Compliance &amp; Carbon Performance — Quantifies immediate financial fine exposure facing non-compliant properties ($2.83 Billion projected liabilities). It isolates top penalty buildings (e.g., Co-Op City at $0.04B/yr) and highlights Multifamily Housing ($1.20B+) and Commercial Offices ($0.40B+) as the core portfolio liabilities alongside a vertical compliance progress banner.</w:t>
+      </w:r>
+      <w:r/>
     </w:p>
     <w:p>
       <w:r>

</xml_diff>

<commit_message>
Update Tableau workbook with Tableau Online QR code and update all documentation references accordingly
</commit_message>
<xml_diff>
--- a/Project Documentations/Carbon_Heist_Mitigation_Documentation.docx
+++ b/Project Documentations/Carbon_Heist_Mitigation_Documentation.docx
@@ -15945,11 +15945,9 @@
         <w:rPr>
           <w:b/>
         </w:rPr>
-        <w:t xml:space="preserve">• Page 3: Decarbonization Roadmap &amp; Live Mobile Bridge — </w:t>
-      </w:r>
-      <w:r>
-        <w:t>Delivers a concrete, 3-step self-funding engineering cascade (Energy Audit -&gt; Building Retrofit -&gt; Green Power Transition). It features detailed prescriptive solutions for LED/HVAC, building envelope insulation, and renewable energy, paired with an embedded mobile-scannable C-Suite QR Code Portal framed in crisp white (#FFFFFF) that allows executives to launch the live web interactive AI Co-Pilot directly from their smartphones.</w:t>
-      </w:r>
+        <w:t>• Page 3: Decarbonization Roadmap &amp; Live Mobile Bridge — Delivers a concrete, 6-playbook self-funding engineering cascade (Surgical Strike -&gt; Retro-commissioning -&gt; Smart Scale -&gt; WET Systems -&gt; Electrification Push). It features detailed prescriptive solutions for LED/HVAC, building envelope insulation, and renewable energy, paired with an embedded mobile-scannable C-Suite QR Code Portal framed in crisp white (#FFFFFF) that allows executives to launch the live online Tableau C-Suite Portal directly from their smartphones.</w:t>
+      </w:r>
+      <w:r/>
     </w:p>
     <w:p>
       <w:r>

</xml_diff>

<commit_message>
Remove Core Calculated Fields & Formulas section and related formula mentions across Tableau README, documentation files, and Word document
</commit_message>
<xml_diff>
--- a/Project Documentations/Carbon_Heist_Mitigation_Documentation.docx
+++ b/Project Documentations/Carbon_Heist_Mitigation_Documentation.docx
@@ -15948,17 +15948,6 @@
         <w:t>• Page 3: Decarbonization Roadmap &amp; Live Mobile Bridge — Delivers a concrete, 6-playbook self-funding engineering cascade (Surgical Strike -&gt; Retro-commissioning -&gt; Smart Scale -&gt; WET Systems -&gt; Electrification Push). It features detailed prescriptive solutions for LED/HVAC, building envelope insulation, and renewable energy, paired with an embedded mobile-scannable C-Suite QR Code Portal framed in crisp white (#FFFFFF) that allows executives to launch the live online Tableau C-Suite Portal directly from their smartphones.</w:t>
       </w:r>
       <w:r/>
-    </w:p>
-    <w:p>
-      <w:r>
-        <w:rPr>
-          <w:b/>
-        </w:rPr>
-        <w:t xml:space="preserve">• Core Calculated Fields &amp; Strict Governance — </w:t>
-      </w:r>
-      <w:r>
-        <w:t>The workbook embeds specialized formulas including [LL97 Risk Category] (4-tier risk classification: Compliant, Moderate, High, Critical), [Penalty Savings Potential] (models a 45% fine reduction via Level 2 audits and basic retrofits), and [Total Records] anchoring exact property aggregations.</w:t>
-      </w:r>
     </w:p>
     <w:p>
       <w:pPr>

</xml_diff>

<commit_message>
Add comprehensive Power BI Executive BI Portal (PowerBI/README.md) and integrate into all directory structures, documentation files, and Word documentation
</commit_message>
<xml_diff>
--- a/Project Documentations/Carbon_Heist_Mitigation_Documentation.docx
+++ b/Project Documentations/Carbon_Heist_Mitigation_Documentation.docx
@@ -15909,17 +15909,12 @@
     </w:p>
     <w:p>
       <w:r>
-        <w:rPr>
-          <w:b/>
-          <w:color w:val="0D1321"/>
-          <w:sz w:val="32"/>
-        </w:rPr>
-        <w:t>5.6 Tableau Executive BI Portal &amp; C-Suite Visual Analytics</w:t>
+        <w:t>5.6 Power BI &amp; Tableau Executive BI Portals &amp; C-Suite Visual Analytics</w:t>
       </w:r>
     </w:p>
     <w:p>
       <w:r>
-        <w:t>To complement the 16-sheet Excel financial model and the live Streamlit application, the project suite integrates a standalone 3-Page Tableau Executive Business Intelligence Portal (NYC_Carbon_Heist_Mitigation_Tableau_Dashboard.twbx). Designed with a high-contrast Royal Navy &amp; Golden aesthetic (#0D1321 / #FFD700), it bridges macro geographical trends with building-level financial fine liabilities.</w:t>
+        <w:t>To complement the 16-sheet Excel financial model and the live Streamlit application, the project suite integrates standalone Dual-Engine 3-Page Executive Business Intelligence Portals: the Power BI Executive BI Portal (NYC_Carbon_Heist_Mitigation_PowerBI_Dashboard.pbix) and the Tableau Executive BI Portal (NYC_Carbon_Heist_Mitigation_Tableau_Dashboard.twbx). Both workbooks feature high-contrast C-Suite aesthetics (#0F172A Dark Royal Navy / #FFD700 Gold), synchronized multi-dimensional slicers, and custom DAX/Calculated measures bridging macro geographical trends down to building-level financial fine liabilities (.83B baseline) and .9M fine savings waterfalls across all 11,638 properties.</w:t>
       </w:r>
     </w:p>
     <w:p>

</xml_diff>

<commit_message>
Update Carbon_Heist_Mitigation_Documentation.docx with Section 5.4 BI verification matrix and Section 6.4 Step 5 navigation guide mirroring markdown structure
</commit_message>
<xml_diff>
--- a/Project Documentations/Carbon_Heist_Mitigation_Documentation.docx
+++ b/Project Documentations/Carbon_Heist_Mitigation_Documentation.docx
@@ -14468,6 +14468,765 @@
     </w:p>
     <w:p>
       <w:pPr>
+        <w:pStyle w:val="Heading2"/>
+        <w:spacing w:before="240" w:after="120"/>
+      </w:pPr>
+      <w:r>
+        <w:rPr>
+          <w:rFonts w:ascii="Calibri" w:hAnsi="Calibri"/>
+          <w:b/>
+          <w:color w:val="0F172A"/>
+          <w:sz w:val="26"/>
+        </w:rPr>
+        <w:t>5.4  Enterprise Visual BI Verification Matrix (Power BI &amp; Tableau)</w:t>
+      </w:r>
+    </w:p>
+    <w:tbl>
+      <w:tblPr>
+        <w:tblW w:type="auto" w:w="0"/>
+        <w:jc w:val="center"/>
+        <w:tblLook w:firstColumn="1" w:firstRow="1" w:lastColumn="0" w:lastRow="0" w:noHBand="0" w:noVBand="1" w:val="04A0"/>
+      </w:tblPr>
+      <w:tblGrid>
+        <w:gridCol w:w="2016"/>
+        <w:gridCol w:w="2016"/>
+        <w:gridCol w:w="2016"/>
+        <w:gridCol w:w="2016"/>
+        <w:gridCol w:w="2016"/>
+      </w:tblGrid>
+      <w:tr>
+        <w:tc>
+          <w:tcPr>
+            <w:tcW w:type="dxa" w:w="1152"/>
+            <w:shd w:val="clear" w:color="auto" w:fill="0F172A"/>
+          </w:tcPr>
+          <w:p>
+            <w:pPr>
+              <w:spacing w:before="60" w:after="60" w:line="276" w:lineRule="auto"/>
+            </w:pPr>
+            <w:r>
+              <w:rPr>
+                <w:rFonts w:ascii="Calibri" w:hAnsi="Calibri"/>
+                <w:b/>
+                <w:color w:val="FFFFFF"/>
+                <w:sz w:val="20"/>
+              </w:rPr>
+              <w:t>Test ID</w:t>
+            </w:r>
+          </w:p>
+        </w:tc>
+        <w:tc>
+          <w:tcPr>
+            <w:tcW w:type="dxa" w:w="2160"/>
+            <w:shd w:val="clear" w:color="auto" w:fill="0F172A"/>
+          </w:tcPr>
+          <w:p>
+            <w:pPr>
+              <w:spacing w:before="60" w:after="60" w:line="276" w:lineRule="auto"/>
+            </w:pPr>
+            <w:r>
+              <w:rPr>
+                <w:rFonts w:ascii="Calibri" w:hAnsi="Calibri"/>
+                <w:b/>
+                <w:color w:val="FFFFFF"/>
+                <w:sz w:val="20"/>
+              </w:rPr>
+              <w:t>Component</w:t>
+            </w:r>
+          </w:p>
+        </w:tc>
+        <w:tc>
+          <w:tcPr>
+            <w:tcW w:type="dxa" w:w="3168"/>
+            <w:shd w:val="clear" w:color="auto" w:fill="0F172A"/>
+          </w:tcPr>
+          <w:p>
+            <w:pPr>
+              <w:spacing w:before="60" w:after="60" w:line="276" w:lineRule="auto"/>
+            </w:pPr>
+            <w:r>
+              <w:rPr>
+                <w:rFonts w:ascii="Calibri" w:hAnsi="Calibri"/>
+                <w:b/>
+                <w:color w:val="FFFFFF"/>
+                <w:sz w:val="20"/>
+              </w:rPr>
+              <w:t>Verification Procedure</w:t>
+            </w:r>
+          </w:p>
+        </w:tc>
+        <w:tc>
+          <w:tcPr>
+            <w:tcW w:type="dxa" w:w="3312"/>
+            <w:shd w:val="clear" w:color="auto" w:fill="0F172A"/>
+          </w:tcPr>
+          <w:p>
+            <w:pPr>
+              <w:spacing w:before="60" w:after="60" w:line="276" w:lineRule="auto"/>
+            </w:pPr>
+            <w:r>
+              <w:rPr>
+                <w:rFonts w:ascii="Calibri" w:hAnsi="Calibri"/>
+                <w:b/>
+                <w:color w:val="FFFFFF"/>
+                <w:sz w:val="20"/>
+              </w:rPr>
+              <w:t>Expected Outcome</w:t>
+            </w:r>
+          </w:p>
+        </w:tc>
+        <w:tc>
+          <w:tcPr>
+            <w:tcW w:type="dxa" w:w="1008"/>
+            <w:shd w:val="clear" w:color="auto" w:fill="0F172A"/>
+          </w:tcPr>
+          <w:p>
+            <w:pPr>
+              <w:spacing w:before="60" w:after="60" w:line="276" w:lineRule="auto"/>
+            </w:pPr>
+            <w:r>
+              <w:rPr>
+                <w:rFonts w:ascii="Calibri" w:hAnsi="Calibri"/>
+                <w:b/>
+                <w:color w:val="FFFFFF"/>
+                <w:sz w:val="20"/>
+              </w:rPr>
+              <w:t>Status</w:t>
+            </w:r>
+          </w:p>
+        </w:tc>
+      </w:tr>
+      <w:tr>
+        <w:tc>
+          <w:tcPr>
+            <w:tcW w:type="dxa" w:w="1152"/>
+          </w:tcPr>
+          <w:p>
+            <w:pPr>
+              <w:spacing w:before="60" w:after="60" w:line="276" w:lineRule="auto"/>
+            </w:pPr>
+            <w:r>
+              <w:rPr>
+                <w:rFonts w:ascii="Calibri" w:hAnsi="Calibri"/>
+                <w:sz w:val="19"/>
+              </w:rPr>
+              <w:t>PBI-01</w:t>
+            </w:r>
+          </w:p>
+        </w:tc>
+        <w:tc>
+          <w:tcPr>
+            <w:tcW w:type="dxa" w:w="2160"/>
+          </w:tcPr>
+          <w:p>
+            <w:pPr>
+              <w:spacing w:before="60" w:after="60" w:line="276" w:lineRule="auto"/>
+            </w:pPr>
+            <w:r>
+              <w:rPr>
+                <w:rFonts w:ascii="Calibri" w:hAnsi="Calibri"/>
+                <w:sz w:val="19"/>
+              </w:rPr>
+              <w:t>Power BI Data Binding</w:t>
+            </w:r>
+          </w:p>
+        </w:tc>
+        <w:tc>
+          <w:tcPr>
+            <w:tcW w:type="dxa" w:w="3168"/>
+          </w:tcPr>
+          <w:p>
+            <w:pPr>
+              <w:spacing w:before="60" w:after="60" w:line="276" w:lineRule="auto"/>
+            </w:pPr>
+            <w:r>
+              <w:rPr>
+                <w:rFonts w:ascii="Calibri" w:hAnsi="Calibri"/>
+                <w:sz w:val="19"/>
+              </w:rPr>
+              <w:t>Open NYC_Carbon_Heist_Mitigation_PowerBI_Dashboard.pbix offline without external database connection.</w:t>
+            </w:r>
+          </w:p>
+        </w:tc>
+        <w:tc>
+          <w:tcPr>
+            <w:tcW w:type="dxa" w:w="3312"/>
+          </w:tcPr>
+          <w:p>
+            <w:pPr>
+              <w:spacing w:before="60" w:after="60" w:line="276" w:lineRule="auto"/>
+            </w:pPr>
+            <w:r>
+              <w:rPr>
+                <w:rFonts w:ascii="Calibri" w:hAnsi="Calibri"/>
+                <w:sz w:val="19"/>
+              </w:rPr>
+              <w:t>All 11,638 records load instantly from internal excel/csv data model without prompt errors.</w:t>
+            </w:r>
+          </w:p>
+        </w:tc>
+        <w:tc>
+          <w:tcPr>
+            <w:tcW w:type="dxa" w:w="1008"/>
+          </w:tcPr>
+          <w:p>
+            <w:pPr>
+              <w:spacing w:before="60" w:after="60" w:line="276" w:lineRule="auto"/>
+            </w:pPr>
+            <w:r>
+              <w:rPr>
+                <w:rFonts w:ascii="Calibri" w:hAnsi="Calibri"/>
+                <w:b/>
+                <w:color w:val="16A34A"/>
+                <w:sz w:val="19"/>
+              </w:rPr>
+              <w:t>PASS</w:t>
+            </w:r>
+          </w:p>
+        </w:tc>
+      </w:tr>
+      <w:tr>
+        <w:tc>
+          <w:tcPr>
+            <w:tcW w:type="dxa" w:w="1152"/>
+          </w:tcPr>
+          <w:p>
+            <w:pPr>
+              <w:spacing w:before="60" w:after="60" w:line="276" w:lineRule="auto"/>
+            </w:pPr>
+            <w:r>
+              <w:rPr>
+                <w:rFonts w:ascii="Calibri" w:hAnsi="Calibri"/>
+                <w:sz w:val="19"/>
+              </w:rPr>
+              <w:t>PBI-02</w:t>
+            </w:r>
+          </w:p>
+        </w:tc>
+        <w:tc>
+          <w:tcPr>
+            <w:tcW w:type="dxa" w:w="2160"/>
+          </w:tcPr>
+          <w:p>
+            <w:pPr>
+              <w:spacing w:before="60" w:after="60" w:line="276" w:lineRule="auto"/>
+            </w:pPr>
+            <w:r>
+              <w:rPr>
+                <w:rFonts w:ascii="Calibri" w:hAnsi="Calibri"/>
+                <w:sz w:val="19"/>
+              </w:rPr>
+              <w:t>Power BI Slicer Synchronization</w:t>
+            </w:r>
+          </w:p>
+        </w:tc>
+        <w:tc>
+          <w:tcPr>
+            <w:tcW w:type="dxa" w:w="3168"/>
+          </w:tcPr>
+          <w:p>
+            <w:pPr>
+              <w:spacing w:before="60" w:after="60" w:line="276" w:lineRule="auto"/>
+            </w:pPr>
+            <w:r>
+              <w:rPr>
+                <w:rFonts w:ascii="Calibri" w:hAnsi="Calibri"/>
+                <w:sz w:val="19"/>
+              </w:rPr>
+              <w:t>Select Manhattan and Multifamily Housing on the left-hand slicers panel.</w:t>
+            </w:r>
+          </w:p>
+        </w:tc>
+        <w:tc>
+          <w:tcPr>
+            <w:tcW w:type="dxa" w:w="3312"/>
+          </w:tcPr>
+          <w:p>
+            <w:pPr>
+              <w:spacing w:before="60" w:after="60" w:line="276" w:lineRule="auto"/>
+            </w:pPr>
+            <w:r>
+              <w:rPr>
+                <w:rFonts w:ascii="Calibri" w:hAnsi="Calibri"/>
+                <w:sz w:val="19"/>
+              </w:rPr>
+              <w:t>All 4 KPI command cards and 4 charts across all 3 pages dynamically filter via synchronized DAX actions.</w:t>
+            </w:r>
+          </w:p>
+        </w:tc>
+        <w:tc>
+          <w:tcPr>
+            <w:tcW w:type="dxa" w:w="1008"/>
+          </w:tcPr>
+          <w:p>
+            <w:pPr>
+              <w:spacing w:before="60" w:after="60" w:line="276" w:lineRule="auto"/>
+            </w:pPr>
+            <w:r>
+              <w:rPr>
+                <w:rFonts w:ascii="Calibri" w:hAnsi="Calibri"/>
+                <w:b/>
+                <w:color w:val="16A34A"/>
+                <w:sz w:val="19"/>
+              </w:rPr>
+              <w:t>PASS</w:t>
+            </w:r>
+          </w:p>
+        </w:tc>
+      </w:tr>
+      <w:tr>
+        <w:tc>
+          <w:tcPr>
+            <w:tcW w:type="dxa" w:w="1152"/>
+          </w:tcPr>
+          <w:p>
+            <w:pPr>
+              <w:spacing w:before="60" w:after="60" w:line="276" w:lineRule="auto"/>
+            </w:pPr>
+            <w:r>
+              <w:rPr>
+                <w:rFonts w:ascii="Calibri" w:hAnsi="Calibri"/>
+                <w:sz w:val="19"/>
+              </w:rPr>
+              <w:t>PBI-03</w:t>
+            </w:r>
+          </w:p>
+        </w:tc>
+        <w:tc>
+          <w:tcPr>
+            <w:tcW w:type="dxa" w:w="2160"/>
+          </w:tcPr>
+          <w:p>
+            <w:pPr>
+              <w:spacing w:before="60" w:after="60" w:line="276" w:lineRule="auto"/>
+            </w:pPr>
+            <w:r>
+              <w:rPr>
+                <w:rFonts w:ascii="Calibri" w:hAnsi="Calibri"/>
+                <w:sz w:val="19"/>
+              </w:rPr>
+              <w:t>Power BI Waterfall Calculation</w:t>
+            </w:r>
+          </w:p>
+        </w:tc>
+        <w:tc>
+          <w:tcPr>
+            <w:tcW w:type="dxa" w:w="3168"/>
+          </w:tcPr>
+          <w:p>
+            <w:pPr>
+              <w:spacing w:before="60" w:after="60" w:line="276" w:lineRule="auto"/>
+            </w:pPr>
+            <w:r>
+              <w:rPr>
+                <w:rFonts w:ascii="Calibri" w:hAnsi="Calibri"/>
+                <w:sz w:val="19"/>
+              </w:rPr>
+              <w:t>Verify Page 3 (Carbon Cost &amp; Savings Analysis) waterfall bridge values.</w:t>
+            </w:r>
+          </w:p>
+        </w:tc>
+        <w:tc>
+          <w:tcPr>
+            <w:tcW w:type="dxa" w:w="3312"/>
+          </w:tcPr>
+          <w:p>
+            <w:pPr>
+              <w:spacing w:before="60" w:after="60" w:line="276" w:lineRule="auto"/>
+            </w:pPr>
+            <w:r>
+              <w:rPr>
+                <w:rFonts w:ascii="Calibri" w:hAnsi="Calibri"/>
+                <w:sz w:val="19"/>
+              </w:rPr>
+              <w:t>Exact parity: Baseline ,830.3M penalty reduced by .9M total fine savings across 6 playbooks down to ,189.37M residual liability.</w:t>
+            </w:r>
+          </w:p>
+        </w:tc>
+        <w:tc>
+          <w:tcPr>
+            <w:tcW w:type="dxa" w:w="1008"/>
+          </w:tcPr>
+          <w:p>
+            <w:pPr>
+              <w:spacing w:before="60" w:after="60" w:line="276" w:lineRule="auto"/>
+            </w:pPr>
+            <w:r>
+              <w:rPr>
+                <w:rFonts w:ascii="Calibri" w:hAnsi="Calibri"/>
+                <w:b/>
+                <w:color w:val="16A34A"/>
+                <w:sz w:val="19"/>
+              </w:rPr>
+              <w:t>PASS</w:t>
+            </w:r>
+          </w:p>
+        </w:tc>
+      </w:tr>
+      <w:tr>
+        <w:tc>
+          <w:tcPr>
+            <w:tcW w:type="dxa" w:w="1152"/>
+          </w:tcPr>
+          <w:p>
+            <w:pPr>
+              <w:spacing w:before="60" w:after="60" w:line="276" w:lineRule="auto"/>
+            </w:pPr>
+            <w:r>
+              <w:rPr>
+                <w:rFonts w:ascii="Calibri" w:hAnsi="Calibri"/>
+                <w:sz w:val="19"/>
+              </w:rPr>
+              <w:t>TAB-01</w:t>
+            </w:r>
+          </w:p>
+        </w:tc>
+        <w:tc>
+          <w:tcPr>
+            <w:tcW w:type="dxa" w:w="2160"/>
+          </w:tcPr>
+          <w:p>
+            <w:pPr>
+              <w:spacing w:before="60" w:after="60" w:line="276" w:lineRule="auto"/>
+            </w:pPr>
+            <w:r>
+              <w:rPr>
+                <w:rFonts w:ascii="Calibri" w:hAnsi="Calibri"/>
+                <w:sz w:val="19"/>
+              </w:rPr>
+              <w:t>Tableau Data Extract Binding</w:t>
+            </w:r>
+          </w:p>
+        </w:tc>
+        <w:tc>
+          <w:tcPr>
+            <w:tcW w:type="dxa" w:w="3168"/>
+          </w:tcPr>
+          <w:p>
+            <w:pPr>
+              <w:spacing w:before="60" w:after="60" w:line="276" w:lineRule="auto"/>
+            </w:pPr>
+            <w:r>
+              <w:rPr>
+                <w:rFonts w:ascii="Calibri" w:hAnsi="Calibri"/>
+                <w:sz w:val="19"/>
+              </w:rPr>
+              <w:t>Open NYC_Carbon_Heist_Mitigation_Tableau_Dashboard.twbx offline without database connection.</w:t>
+            </w:r>
+          </w:p>
+        </w:tc>
+        <w:tc>
+          <w:tcPr>
+            <w:tcW w:type="dxa" w:w="3312"/>
+          </w:tcPr>
+          <w:p>
+            <w:pPr>
+              <w:spacing w:before="60" w:after="60" w:line="276" w:lineRule="auto"/>
+            </w:pPr>
+            <w:r>
+              <w:rPr>
+                <w:rFonts w:ascii="Calibri" w:hAnsi="Calibri"/>
+                <w:sz w:val="19"/>
+              </w:rPr>
+              <w:t>All 11,638 records load instantly from internal .csv extract without prompts.</w:t>
+            </w:r>
+          </w:p>
+        </w:tc>
+        <w:tc>
+          <w:tcPr>
+            <w:tcW w:type="dxa" w:w="1008"/>
+          </w:tcPr>
+          <w:p>
+            <w:pPr>
+              <w:spacing w:before="60" w:after="60" w:line="276" w:lineRule="auto"/>
+            </w:pPr>
+            <w:r>
+              <w:rPr>
+                <w:rFonts w:ascii="Calibri" w:hAnsi="Calibri"/>
+                <w:b/>
+                <w:color w:val="16A34A"/>
+                <w:sz w:val="19"/>
+              </w:rPr>
+              <w:t>PASS</w:t>
+            </w:r>
+          </w:p>
+        </w:tc>
+      </w:tr>
+      <w:tr>
+        <w:tc>
+          <w:tcPr>
+            <w:tcW w:type="dxa" w:w="1152"/>
+          </w:tcPr>
+          <w:p>
+            <w:pPr>
+              <w:spacing w:before="60" w:after="60" w:line="276" w:lineRule="auto"/>
+            </w:pPr>
+            <w:r>
+              <w:rPr>
+                <w:rFonts w:ascii="Calibri" w:hAnsi="Calibri"/>
+                <w:sz w:val="19"/>
+              </w:rPr>
+              <w:t>TAB-02</w:t>
+            </w:r>
+          </w:p>
+        </w:tc>
+        <w:tc>
+          <w:tcPr>
+            <w:tcW w:type="dxa" w:w="2160"/>
+          </w:tcPr>
+          <w:p>
+            <w:pPr>
+              <w:spacing w:before="60" w:after="60" w:line="276" w:lineRule="auto"/>
+            </w:pPr>
+            <w:r>
+              <w:rPr>
+                <w:rFonts w:ascii="Calibri" w:hAnsi="Calibri"/>
+                <w:sz w:val="19"/>
+              </w:rPr>
+              <w:t>Tableau Borough &amp; Type Filters</w:t>
+            </w:r>
+          </w:p>
+        </w:tc>
+        <w:tc>
+          <w:tcPr>
+            <w:tcW w:type="dxa" w:w="3168"/>
+          </w:tcPr>
+          <w:p>
+            <w:pPr>
+              <w:spacing w:before="60" w:after="60" w:line="276" w:lineRule="auto"/>
+            </w:pPr>
+            <w:r>
+              <w:rPr>
+                <w:rFonts w:ascii="Calibri" w:hAnsi="Calibri"/>
+                <w:sz w:val="19"/>
+              </w:rPr>
+              <w:t>Select Manhattan and Commercial Office on global dropdowns.</w:t>
+            </w:r>
+          </w:p>
+        </w:tc>
+        <w:tc>
+          <w:tcPr>
+            <w:tcW w:type="dxa" w:w="3312"/>
+          </w:tcPr>
+          <w:p>
+            <w:pPr>
+              <w:spacing w:before="60" w:after="60" w:line="276" w:lineRule="auto"/>
+            </w:pPr>
+            <w:r>
+              <w:rPr>
+                <w:rFonts w:ascii="Calibri" w:hAnsi="Calibri"/>
+                <w:sz w:val="19"/>
+              </w:rPr>
+              <w:t>All charts across all 3 pages dynamically filter via synchronized actions.</w:t>
+            </w:r>
+          </w:p>
+        </w:tc>
+        <w:tc>
+          <w:tcPr>
+            <w:tcW w:type="dxa" w:w="1008"/>
+          </w:tcPr>
+          <w:p>
+            <w:pPr>
+              <w:spacing w:before="60" w:after="60" w:line="276" w:lineRule="auto"/>
+            </w:pPr>
+            <w:r>
+              <w:rPr>
+                <w:rFonts w:ascii="Calibri" w:hAnsi="Calibri"/>
+                <w:b/>
+                <w:color w:val="16A34A"/>
+                <w:sz w:val="19"/>
+              </w:rPr>
+              <w:t>PASS</w:t>
+            </w:r>
+          </w:p>
+        </w:tc>
+      </w:tr>
+      <w:tr>
+        <w:tc>
+          <w:tcPr>
+            <w:tcW w:type="dxa" w:w="1152"/>
+          </w:tcPr>
+          <w:p>
+            <w:pPr>
+              <w:spacing w:before="60" w:after="60" w:line="276" w:lineRule="auto"/>
+            </w:pPr>
+            <w:r>
+              <w:rPr>
+                <w:rFonts w:ascii="Calibri" w:hAnsi="Calibri"/>
+                <w:sz w:val="19"/>
+              </w:rPr>
+              <w:t>TAB-03</w:t>
+            </w:r>
+          </w:p>
+        </w:tc>
+        <w:tc>
+          <w:tcPr>
+            <w:tcW w:type="dxa" w:w="2160"/>
+          </w:tcPr>
+          <w:p>
+            <w:pPr>
+              <w:spacing w:before="60" w:after="60" w:line="276" w:lineRule="auto"/>
+            </w:pPr>
+            <w:r>
+              <w:rPr>
+                <w:rFonts w:ascii="Calibri" w:hAnsi="Calibri"/>
+                <w:sz w:val="19"/>
+              </w:rPr>
+              <w:t>Tableau Fine Calculation Accuracy</w:t>
+            </w:r>
+          </w:p>
+        </w:tc>
+        <w:tc>
+          <w:tcPr>
+            <w:tcW w:type="dxa" w:w="3168"/>
+          </w:tcPr>
+          <w:p>
+            <w:pPr>
+              <w:spacing w:before="60" w:after="60" w:line="276" w:lineRule="auto"/>
+            </w:pPr>
+            <w:r>
+              <w:rPr>
+                <w:rFonts w:ascii="Calibri" w:hAnsi="Calibri"/>
+                <w:sz w:val="19"/>
+              </w:rPr>
+              <w:t>Audit Top Penalty Buildings bar chart against raw formulas.</w:t>
+            </w:r>
+          </w:p>
+        </w:tc>
+        <w:tc>
+          <w:tcPr>
+            <w:tcW w:type="dxa" w:w="3312"/>
+          </w:tcPr>
+          <w:p>
+            <w:pPr>
+              <w:spacing w:before="60" w:after="60" w:line="276" w:lineRule="auto"/>
+            </w:pPr>
+            <w:r>
+              <w:rPr>
+                <w:rFonts w:ascii="Calibri" w:hAnsi="Calibri"/>
+                <w:sz w:val="19"/>
+              </w:rPr>
+              <w:t>Co-Op City outputs exact .04B/yr penalty consistent with Python ML pipeline.</w:t>
+            </w:r>
+          </w:p>
+        </w:tc>
+        <w:tc>
+          <w:tcPr>
+            <w:tcW w:type="dxa" w:w="1008"/>
+          </w:tcPr>
+          <w:p>
+            <w:pPr>
+              <w:spacing w:before="60" w:after="60" w:line="276" w:lineRule="auto"/>
+            </w:pPr>
+            <w:r>
+              <w:rPr>
+                <w:rFonts w:ascii="Calibri" w:hAnsi="Calibri"/>
+                <w:b/>
+                <w:color w:val="16A34A"/>
+                <w:sz w:val="19"/>
+              </w:rPr>
+              <w:t>PASS</w:t>
+            </w:r>
+          </w:p>
+        </w:tc>
+      </w:tr>
+      <w:tr>
+        <w:tc>
+          <w:tcPr>
+            <w:tcW w:type="dxa" w:w="1152"/>
+          </w:tcPr>
+          <w:p>
+            <w:pPr>
+              <w:spacing w:before="60" w:after="60" w:line="276" w:lineRule="auto"/>
+            </w:pPr>
+            <w:r>
+              <w:rPr>
+                <w:rFonts w:ascii="Calibri" w:hAnsi="Calibri"/>
+                <w:sz w:val="19"/>
+              </w:rPr>
+              <w:t>TAB-04</w:t>
+            </w:r>
+          </w:p>
+        </w:tc>
+        <w:tc>
+          <w:tcPr>
+            <w:tcW w:type="dxa" w:w="2160"/>
+          </w:tcPr>
+          <w:p>
+            <w:pPr>
+              <w:spacing w:before="60" w:after="60" w:line="276" w:lineRule="auto"/>
+            </w:pPr>
+            <w:r>
+              <w:rPr>
+                <w:rFonts w:ascii="Calibri" w:hAnsi="Calibri"/>
+                <w:sz w:val="19"/>
+              </w:rPr>
+              <w:t>Tableau C-Suite QR Bridge</w:t>
+            </w:r>
+          </w:p>
+        </w:tc>
+        <w:tc>
+          <w:tcPr>
+            <w:tcW w:type="dxa" w:w="3168"/>
+          </w:tcPr>
+          <w:p>
+            <w:pPr>
+              <w:spacing w:before="60" w:after="60" w:line="276" w:lineRule="auto"/>
+            </w:pPr>
+            <w:r>
+              <w:rPr>
+                <w:rFonts w:ascii="Calibri" w:hAnsi="Calibri"/>
+                <w:sz w:val="19"/>
+              </w:rPr>
+              <w:t>Scan embedded QR code (#FFFFFF border) from 2 meters with iOS/Android device.</w:t>
+            </w:r>
+          </w:p>
+        </w:tc>
+        <w:tc>
+          <w:tcPr>
+            <w:tcW w:type="dxa" w:w="3312"/>
+          </w:tcPr>
+          <w:p>
+            <w:pPr>
+              <w:spacing w:before="60" w:after="60" w:line="276" w:lineRule="auto"/>
+            </w:pPr>
+            <w:r>
+              <w:rPr>
+                <w:rFonts w:ascii="Calibri" w:hAnsi="Calibri"/>
+                <w:sz w:val="19"/>
+              </w:rPr>
+              <w:t>Instant camera focus and redirection to the live online Tableau C-Suite Portal.</w:t>
+            </w:r>
+          </w:p>
+        </w:tc>
+        <w:tc>
+          <w:tcPr>
+            <w:tcW w:type="dxa" w:w="1008"/>
+          </w:tcPr>
+          <w:p>
+            <w:pPr>
+              <w:spacing w:before="60" w:after="60" w:line="276" w:lineRule="auto"/>
+            </w:pPr>
+            <w:r>
+              <w:rPr>
+                <w:rFonts w:ascii="Calibri" w:hAnsi="Calibri"/>
+                <w:b/>
+                <w:color w:val="16A34A"/>
+                <w:sz w:val="19"/>
+              </w:rPr>
+              <w:t>PASS</w:t>
+            </w:r>
+          </w:p>
+        </w:tc>
+      </w:tr>
+    </w:tbl>
+    <w:p>
+      <w:pPr>
+        <w:spacing w:after="240"/>
+      </w:pPr>
+    </w:p>
+    <w:p>
+      <w:pPr>
         <w:pStyle w:val="Heading1"/>
         <w:pBdr>
           <w:bottom w:val="single" w:sz="12" w:space="6" w:color="C89B3C"/>
@@ -15612,6 +16371,42 @@
     </w:p>
     <w:p>
       <w:pPr>
+        <w:spacing w:before="60" w:after="80" w:line="276" w:lineRule="auto"/>
+      </w:pPr>
+      <w:r>
+        <w:rPr>
+          <w:rFonts w:ascii="Calibri" w:hAnsi="Calibri"/>
+          <w:sz w:val="22"/>
+        </w:rPr>
+        <w:t>Step 5 – Navigating the Enterprise Visual BI Portals (Power BI &amp; Tableau): To complement the Streamlit web dashboard and the 16-sheet Excel financial model, the project suite integrates standalone Dual-Engine 3-Page Executive Business Intelligence Portals: NYC_Carbon_Heist_Mitigation_PowerBI_Dashboard.pbix and NYC_Carbon_Heist_Mitigation_Tableau_Dashboard.twbx.</w:t>
+      </w:r>
+    </w:p>
+    <w:p>
+      <w:pPr>
+        <w:spacing w:before="60" w:after="80" w:line="276" w:lineRule="auto"/>
+      </w:pPr>
+      <w:r>
+        <w:rPr>
+          <w:rFonts w:ascii="Calibri" w:hAnsi="Calibri"/>
+          <w:sz w:val="22"/>
+        </w:rPr>
+        <w:t>• Power BI Portal (NYC_Carbon_Heist_Mitigation_PowerBI_Dashboard.pbix): Features 3 progressive pages (Factors Affecting GHG Emissions -&gt; Asset Granularity &amp; Construction Era -&gt; Carbon Cost &amp; Savings Analysis Waterfall) built with Dark Royal Navy styling (#0F172A), custom DAX measures, and synchronized slicers for Borough, Property Type, and Decade Built.</w:t>
+      </w:r>
+    </w:p>
+    <w:p>
+      <w:pPr>
+        <w:spacing w:before="60" w:after="80" w:line="276" w:lineRule="auto"/>
+      </w:pPr>
+      <w:r>
+        <w:rPr>
+          <w:rFonts w:ascii="Calibri" w:hAnsi="Calibri"/>
+          <w:sz w:val="22"/>
+        </w:rPr>
+        <w:t>• Tableau Portal (NYC_Carbon_Heist_Mitigation_Tableau_Dashboard.twbx): Features 3 progressive pages (NYC Energy Efficiency &amp; Emissions Monitor -&gt; LL97 Compliance &amp; Carbon Performance -&gt; Decarbonization Roadmap) packaged with internal data extracts (.csv) and an embedded mobile-scannable QR code framed in crisp white (#FFFFFF) for instant boardroom presentation bridging to the live online Tableau portal.</w:t>
+      </w:r>
+    </w:p>
+    <w:p>
+      <w:pPr>
         <w:spacing w:after="300"/>
       </w:pPr>
     </w:p>
@@ -15905,74 +16700,6 @@
           <w:szCs w:val="19"/>
         </w:rPr>
         <w:t xml:space="preserve">  July 2026</w:t>
-      </w:r>
-    </w:p>
-    <w:p>
-      <w:r>
-        <w:t>5.6 Power BI &amp; Tableau Executive BI Portals &amp; C-Suite Visual Analytics</w:t>
-      </w:r>
-    </w:p>
-    <w:p>
-      <w:r>
-        <w:t>To complement the 16-sheet Excel financial model and the live Streamlit application, the project suite integrates standalone Dual-Engine 3-Page Executive Business Intelligence Portals: the Power BI Executive BI Portal (NYC_Carbon_Heist_Mitigation_PowerBI_Dashboard.pbix) and the Tableau Executive BI Portal (NYC_Carbon_Heist_Mitigation_Tableau_Dashboard.twbx). Both workbooks feature high-contrast C-Suite aesthetics (#0F172A Dark Royal Navy / #FFD700 Gold), synchronized multi-dimensional slicers, and custom DAX/Calculated measures bridging macro geographical trends down to building-level financial fine liabilities (.83B baseline) and .9M fine savings waterfalls across all 11,638 properties.</w:t>
-      </w:r>
-    </w:p>
-    <w:p>
-      <w:r>
-        <w:rPr>
-          <w:b/>
-        </w:rPr>
-        <w:t>• Page 1: NYC Energy Efficiency &amp; Emissions Monitor — Establishes the macro footprint of NYC's greenhouse gas emissions across the five boroughs (10.56M Metric Tons CO2e), highlighting Manhattan (5.40M MT) and Brooklyn (1.75M MT) via horizontal bars, geographic choropleth maps, decade-built histograms, and area scatter plots.</w:t>
-      </w:r>
-      <w:r/>
-    </w:p>
-    <w:p>
-      <w:r>
-        <w:rPr>
-          <w:b/>
-        </w:rPr>
-        <w:t>• Page 2: LL97 Compliance &amp; Carbon Performance — Quantifies immediate financial fine exposure facing non-compliant properties ($2.83 Billion projected liabilities). It isolates top penalty buildings (e.g., Co-Op City at $0.04B/yr) and highlights Multifamily Housing ($1.20B+) and Commercial Offices ($0.40B+) as the core portfolio liabilities alongside a vertical compliance progress banner.</w:t>
-      </w:r>
-      <w:r/>
-    </w:p>
-    <w:p>
-      <w:r>
-        <w:rPr>
-          <w:b/>
-        </w:rPr>
-        <w:t>• Page 3: Decarbonization Roadmap &amp; Live Mobile Bridge — Delivers a concrete, 6-playbook self-funding engineering cascade (Surgical Strike -&gt; Retro-commissioning -&gt; Smart Scale -&gt; WET Systems -&gt; Electrification Push). It features detailed prescriptive solutions for LED/HVAC, building envelope insulation, and renewable energy, paired with an embedded mobile-scannable C-Suite QR Code Portal framed in crisp white (#FFFFFF) that allows executives to launch the live online Tableau C-Suite Portal directly from their smartphones.</w:t>
-      </w:r>
-      <w:r/>
-    </w:p>
-    <w:p>
-      <w:pPr>
-        <w:jc w:val="center"/>
-      </w:pPr>
-      <w:r>
-        <w:rPr>
-          <w:color w:val="1F7A6E"/>
-          <w:sz w:val="19"/>
-          <w:szCs w:val="19"/>
-        </w:rPr>
-        <w:t>github.com/</w:t>
-      </w:r>
-      <w:proofErr w:type="spellStart"/>
-      <w:r>
-        <w:rPr>
-          <w:color w:val="1F7A6E"/>
-          <w:sz w:val="19"/>
-          <w:szCs w:val="19"/>
-        </w:rPr>
-        <w:t>ahmedadelamin</w:t>
-      </w:r>
-      <w:proofErr w:type="spellEnd"/>
-      <w:r>
-        <w:rPr>
-          <w:color w:val="1F7A6E"/>
-          <w:sz w:val="19"/>
-          <w:szCs w:val="19"/>
-        </w:rPr>
-        <w:t>/carbon-heist-mitigation</w:t>
       </w:r>
     </w:p>
     <w:sectPr>

</xml_diff>